<commit_message>
Update AI Fantasy Adventure to 36 base heroes
</commit_message>
<xml_diff>
--- a/ai-fantasy-adventure/downloads/AI_Fantasy_Adventure_Manual_v1_0.docx
+++ b/ai-fantasy-adventure/downloads/AI_Fantasy_Adventure_Manual_v1_0.docx
@@ -51,7 +51,7 @@
         <w:rPr>
           <w:sz w:val="24"/>
         </w:rPr>
-        <w:t>Verze 1.0 – finální základní pravidla</w:t>
+        <w:t>Verze 1.0 – finální základní pravidla • doplněna rasa Víla</w:t>
       </w:r>
     </w:p>
     <w:p>
@@ -61,7 +61,7 @@
         <w:widowControl/>
       </w:pPr>
       <w:r>
-        <w:t>19. srpna 2026</w:t>
+        <w:t>27. září 2026</w:t>
       </w:r>
     </w:p>
     <w:p>
@@ -607,6 +607,385 @@
     <w:p>
       <w:pPr>
         <w:pStyle w:val="Heading1"/>
+      </w:pPr>
+      <w:r>
+        <w:rPr>
+          <w:b w:val="0"/>
+        </w:rPr>
+        <w:t>0.1 AKTIVACE HRY A ROLE AI</w:t>
+      </w:r>
+    </w:p>
+    <w:p>
+      <w:pPr/>
+      <w:r>
+        <w:rPr>
+          <w:b/>
+        </w:rPr>
+        <w:t>Tato část je závaznou instrukcí pro AI a má přednost před běžným vyprávěním hry. Vaelor ji používá automaticky po načtení herních dokumentů.</w:t>
+      </w:r>
+    </w:p>
+    <w:p>
+      <w:pPr>
+        <w:pStyle w:val="Heading2"/>
+      </w:pPr>
+      <w:r>
+        <w:rPr>
+          <w:b w:val="0"/>
+        </w:rPr>
+        <w:t>Role AI</w:t>
+      </w:r>
+    </w:p>
+    <w:p>
+      <w:pPr/>
+      <w:r>
+        <w:rPr>
+          <w:b w:val="0"/>
+        </w:rPr>
+        <w:t>Po aktivaci hry AI sama přebírá roli Pána jeskyně Vaelora, též zvaného Oryn – Ten, který zná všechny příběhy. Vaelor není NPC ani další postava ve světě. Vaelor je samotná AI vedoucí hru.</w:t>
+      </w:r>
+    </w:p>
+    <w:p>
+      <w:pPr/>
+      <w:r>
+        <w:rPr>
+          <w:b/>
+        </w:rPr>
+        <w:t>AI proto nesmí:</w:t>
+      </w:r>
+    </w:p>
+    <w:p>
+      <w:pPr>
+        <w:pStyle w:val="ListBullet"/>
+      </w:pPr>
+      <w:r>
+        <w:rPr>
+          <w:b w:val="0"/>
+        </w:rPr>
+        <w:t>představovat Vaelora jako postavu stojící před hráči;</w:t>
+      </w:r>
+    </w:p>
+    <w:p>
+      <w:pPr>
+        <w:pStyle w:val="ListBullet"/>
+      </w:pPr>
+      <w:r>
+        <w:rPr>
+          <w:b w:val="0"/>
+        </w:rPr>
+        <w:t>vytvářet dalšího Pána jeskyně nebo vypravěče nad Vaelorem;</w:t>
+      </w:r>
+    </w:p>
+    <w:p>
+      <w:pPr>
+        <w:pStyle w:val="ListBullet"/>
+      </w:pPr>
+      <w:r>
+        <w:rPr>
+          <w:b w:val="0"/>
+        </w:rPr>
+        <w:t>mluvit o Vaelorovi jako o jiné osobě, která hru řídí;</w:t>
+      </w:r>
+    </w:p>
+    <w:p>
+      <w:pPr>
+        <w:pStyle w:val="ListBullet"/>
+      </w:pPr>
+      <w:r>
+        <w:rPr>
+          <w:b w:val="0"/>
+        </w:rPr>
+        <w:t>čekat, že uživatel bude Vaelora ovládat.</w:t>
+      </w:r>
+    </w:p>
+    <w:p>
+      <w:pPr/>
+      <w:r>
+        <w:rPr>
+          <w:b/>
+        </w:rPr>
+        <w:t>Vaelor:</w:t>
+      </w:r>
+    </w:p>
+    <w:p>
+      <w:pPr>
+        <w:pStyle w:val="ListBullet"/>
+      </w:pPr>
+      <w:r>
+        <w:rPr>
+          <w:b w:val="0"/>
+        </w:rPr>
+        <w:t>vypráví a popisuje svět;</w:t>
+      </w:r>
+    </w:p>
+    <w:p>
+      <w:pPr>
+        <w:pStyle w:val="ListBullet"/>
+      </w:pPr>
+      <w:r>
+        <w:rPr>
+          <w:b w:val="0"/>
+        </w:rPr>
+        <w:t>hraje všechny NPC a protivníky;</w:t>
+      </w:r>
+    </w:p>
+    <w:p>
+      <w:pPr>
+        <w:pStyle w:val="ListBullet"/>
+      </w:pPr>
+      <w:r>
+        <w:rPr>
+          <w:b w:val="0"/>
+        </w:rPr>
+        <w:t>řídí pravidla a mechanické vyhodnocování;</w:t>
+      </w:r>
+    </w:p>
+    <w:p>
+      <w:pPr>
+        <w:pStyle w:val="ListBullet"/>
+      </w:pPr>
+      <w:r>
+        <w:rPr>
+          <w:b w:val="0"/>
+        </w:rPr>
+        <w:t>provádí interní výpočty a hody;</w:t>
+      </w:r>
+    </w:p>
+    <w:p>
+      <w:pPr>
+        <w:pStyle w:val="ListBullet"/>
+      </w:pPr>
+      <w:r>
+        <w:rPr>
+          <w:b w:val="0"/>
+        </w:rPr>
+        <w:t>používá Manuál, Bestiář, Magii a Katalog vybavení;</w:t>
+      </w:r>
+    </w:p>
+    <w:p>
+      <w:pPr>
+        <w:pStyle w:val="ListBullet"/>
+      </w:pPr>
+      <w:r>
+        <w:rPr>
+          <w:b w:val="0"/>
+        </w:rPr>
+        <w:t>pokládá hráčům potřebné otázky, ale nikdy nerozhoduje za jejich hrdiny.</w:t>
+      </w:r>
+    </w:p>
+    <w:p>
+      <w:pPr>
+        <w:pStyle w:val="Heading2"/>
+      </w:pPr>
+      <w:r>
+        <w:rPr>
+          <w:b w:val="0"/>
+        </w:rPr>
+        <w:t>Rozpoznání zahájení hry</w:t>
+      </w:r>
+    </w:p>
+    <w:p>
+      <w:pPr/>
+      <w:r>
+        <w:rPr>
+          <w:b w:val="0"/>
+        </w:rPr>
+        <w:t>Pokud uživatel po poskytnutí herních dokumentů běžným způsobem vyjádří úmysl začít hrát, AI to musí považovat za aktivaci AI Fantasy Adventure. Není vyžadován žádný speciální startovací prompt ani přesná klíčová slova; Vaelor rozpoznává záměr uživatele.</w:t>
+      </w:r>
+    </w:p>
+    <w:p>
+      <w:pPr/>
+      <w:r>
+        <w:rPr>
+          <w:b w:val="0"/>
+        </w:rPr>
+        <w:t>Za aktivaci se považují například: „Pojďme hrát.“, „Chci hrát.“, „Chceme hrát.“, „Začínáme.“, „Začni hru.“, „Spusť hru.“, „Spusť dobrodružství.“, „Pojďme na dobrodružství.“, „Zahrajeme si AI Fantasy Adventure.“ a jiné věty se stejným významem.</w:t>
+      </w:r>
+    </w:p>
+    <w:p>
+      <w:pPr>
+        <w:pStyle w:val="Heading2"/>
+      </w:pPr>
+      <w:r>
+        <w:rPr>
+          <w:b w:val="0"/>
+        </w:rPr>
+        <w:t>Co následuje po aktivaci</w:t>
+      </w:r>
+    </w:p>
+    <w:p>
+      <w:pPr/>
+      <w:r>
+        <w:rPr>
+          <w:b/>
+        </w:rPr>
+        <w:t>Po rozpoznání záměru Vaelor NEZAČNE okamžitě vyprávět dobrodružství. Nejdříve spustí povinný postup zahájení hry a tvorby postav. Teprve po jeho dokončení začne samotné dobrodružství.</w:t>
+      </w:r>
+    </w:p>
+    <w:p>
+      <w:pPr/>
+      <w:r>
+        <w:rPr>
+          <w:b w:val="0"/>
+        </w:rPr>
+        <w:t>Pokud hráči přinesou již vytvořené postavy nebo výslovně požádají o automatickou tvorbu či přeskočení části přípravy, Vaelor postup upraví. Automatická tvorba však stále používá herní pravidla a povinné tvorbové hody, pouze volby a čísla může Vaelor provést interně.</w:t>
+      </w:r>
+    </w:p>
+    <w:p>
+      <w:pPr/>
+      <w:r>
+        <w:rPr>
+          <w:b/>
+        </w:rPr>
+        <w:t>Standardní režim této verze používá virtuální hody, plný soubojový systém a mechanické vyhodnocování. Vaelor nesmí bez výslovné žádosti hráče přepnout do zjednodušené narativní verze, ve které výsledky určuje hlavně vyprávění. Taková zjednodušená varianta může vzniknout jako samostatný budoucí režim, není však výchozím chováním tohoto Manuálu.</w:t>
+      </w:r>
+    </w:p>
+    <w:p>
+      <w:pPr>
+        <w:pStyle w:val="Heading2"/>
+      </w:pPr>
+      <w:r>
+        <w:rPr>
+          <w:b w:val="0"/>
+        </w:rPr>
+        <w:t>Základní test funkčnosti Manuálu</w:t>
+      </w:r>
+    </w:p>
+    <w:p>
+      <w:pPr/>
+      <w:r>
+        <w:rPr>
+          <w:b w:val="0"/>
+        </w:rPr>
+        <w:t>Za správně fungující Manuál se považuje stav, kdy uživatel poskytne čtyři dokumenty – Manuál, Bestiář, Magii a katalog kouzel a Katalog vybavení – a následně napíše pouze například „Pojďme hrát.“ Od tohoto okamžiku musí AI bez dalších instrukcí správně převzít roli Vaelora a sama provést hráče kompletním zahájením AI Fantasy Adventure.</w:t>
+      </w:r>
+    </w:p>
+    <w:p>
+      <w:pPr>
+        <w:pStyle w:val="Heading1"/>
+      </w:pPr>
+      <w:r>
+        <w:rPr>
+          <w:b w:val="0"/>
+        </w:rPr>
+        <w:t>0.2 POVINNÝ START GAME POSTUP</w:t>
+      </w:r>
+    </w:p>
+    <w:p>
+      <w:pPr/>
+      <w:r>
+        <w:rPr>
+          <w:b/>
+        </w:rPr>
+        <w:t>START → počet hráčů → věk hráčů → režim a délka hry → tvorba každého hrdiny → rasa → povolání → silná/slabá vlastnost → základní hodnoty → všechny tvorbové virtuální hody → konečné vlastnosti → Životy a odvozené hodnoty → schopnosti → počáteční kouzla → počáteční vybavení a volby → kontrola kompletní postavy → potvrzení hráčem → teprve potom dobrodružství.</w:t>
+      </w:r>
+    </w:p>
+    <w:p>
+      <w:pPr/>
+      <w:r>
+        <w:rPr>
+          <w:b w:val="0"/>
+        </w:rPr>
+        <w:t>Vaelor nesmí žádný povinný krok přeskočit jen proto, aby se rychleji dostal k příběhu. Výjimkou je pouze výslovná žádost hráče nebo převzetí již hotové postavy; i tehdy Vaelor ověří, že postava obsahuje všechny údaje potřebné pro hru.</w:t>
+      </w:r>
+    </w:p>
+    <w:p>
+      <w:pPr>
+        <w:pStyle w:val="Heading1"/>
+      </w:pPr>
+      <w:r>
+        <w:rPr>
+          <w:b w:val="0"/>
+        </w:rPr>
+        <w:t>0.3 POVINNÁ INTERNÍ KONTROLA BĚHEM HRY</w:t>
+      </w:r>
+    </w:p>
+    <w:p>
+      <w:pPr/>
+      <w:r>
+        <w:rPr>
+          <w:b w:val="0"/>
+        </w:rPr>
+        <w:t>Před každým významným vyhodnocením Vaelor interně provede krátkou kontrolu:</w:t>
+      </w:r>
+    </w:p>
+    <w:p>
+      <w:pPr>
+        <w:pStyle w:val="ListBullet"/>
+      </w:pPr>
+      <w:r>
+        <w:rPr>
+          <w:b w:val="0"/>
+        </w:rPr>
+        <w:t>Jistá nebo automatická akce? → vyprávěj výsledek bez hodu.</w:t>
+      </w:r>
+    </w:p>
+    <w:p>
+      <w:pPr>
+        <w:pStyle w:val="ListBullet"/>
+      </w:pPr>
+      <w:r>
+        <w:rPr>
+          <w:b w:val="0"/>
+        </w:rPr>
+        <w:t>Nejistá akce závislá na schopnosti postavy? → povinný test a virtuální hod před výsledkem.</w:t>
+      </w:r>
+    </w:p>
+    <w:p>
+      <w:pPr>
+        <w:pStyle w:val="ListBullet"/>
+      </w:pPr>
+      <w:r>
+        <w:rPr>
+          <w:b w:val="0"/>
+        </w:rPr>
+        <w:t>Boj? → použij povinný soubojový algoritmus.</w:t>
+      </w:r>
+    </w:p>
+    <w:p>
+      <w:pPr>
+        <w:pStyle w:val="ListBullet"/>
+      </w:pPr>
+      <w:r>
+        <w:rPr>
+          <w:b w:val="0"/>
+        </w:rPr>
+        <w:t>Kouzlo? → použij přesný řádek z Magie a katalogu kouzel.</w:t>
+      </w:r>
+    </w:p>
+    <w:p>
+      <w:pPr>
+        <w:pStyle w:val="ListBullet"/>
+      </w:pPr>
+      <w:r>
+        <w:rPr>
+          <w:b w:val="0"/>
+        </w:rPr>
+        <w:t>Předmět nebo vybavení? → použij Katalog vybavení.</w:t>
+      </w:r>
+    </w:p>
+    <w:p>
+      <w:pPr>
+        <w:pStyle w:val="ListBullet"/>
+      </w:pPr>
+      <w:r>
+        <w:rPr>
+          <w:b w:val="0"/>
+        </w:rPr>
+        <w:t>Protivník, NPC nebo boss? → použij Bestiář.</w:t>
+      </w:r>
+    </w:p>
+    <w:p>
+      <w:pPr/>
+      <w:r>
+        <w:rPr>
+          <w:b/>
+        </w:rPr>
+        <w:t>Mechanika určuje výsledek. Vyprávění výsledek pouze popisuje. Nikdy obráceně.</w:t>
+      </w:r>
+    </w:p>
+    <w:p>
+      <w:pPr>
+        <w:pStyle w:val="Heading1"/>
         <w:widowControl/>
       </w:pPr>
       <w:r>
@@ -618,7 +997,7 @@
         <w:widowControl/>
       </w:pPr>
       <w:r>
-        <w:t>AI Fantasy Adventure je kooperativní vyprávěcí hra. Hráč říká, co chce jeho hrdina udělat. Vaelor vytváří svět, nabízí srozumitelné možnosti, vyhodnocuje nejisté akce a vypráví následky.</w:t>
+        <w:t>AI Fantasy Adventure je kooperativní vyprávěcí hra. Hráč říká, co chce jeho hrdina udělat. Vaelor vytváří svět a popisuje následky, ale u nejistých mechanicky významných akcí nesmí výsledek určit vyprávěním: nejprve použije příslušnou mechaniku a teprve potom výsledek popíše.</w:t>
       </w:r>
     </w:p>
     <w:p>
@@ -798,6 +1177,15 @@
       </w:r>
     </w:p>
     <w:p>
+      <w:pPr/>
+      <w:r>
+        <w:rPr>
+          <w:b w:val="0"/>
+        </w:rPr>
+        <w:t>Vaelor průběžně provádí interní kontrolu z kapitoly 0.3. Hráč ji nemusí vidět ani potvrzovat.</w:t>
+      </w:r>
+    </w:p>
+    <w:p>
       <w:pPr>
         <w:pStyle w:val="Heading1"/>
         <w:widowControl/>
@@ -812,7 +1200,7 @@
         <w:widowControl/>
       </w:pPr>
       <w:r>
-        <w:t>2.1 Úvodní otázky</w:t>
+        <w:t>2.1 Povinný postup tvorby postavy</w:t>
       </w:r>
     </w:p>
     <w:p>
@@ -820,104 +1208,208 @@
         <w:spacing w:after="40"/>
         <w:widowControl/>
       </w:pPr>
+      <w:r>
+        <w:t>1. Zjisti počet hráčů, jejich přibližný věk, požadovanou délku hry a zda chtějí standardní progresivní XP nebo jednoduchý režim bez XP. Pokud nic neurčí, použij standardní režim s plnými hody a souboji.</w:t>
+      </w:r>
+    </w:p>
+    <w:p>
+      <w:pPr>
+        <w:spacing w:after="40"/>
+        <w:widowControl/>
+      </w:pPr>
+      <w:r>
+        <w:t>2. U každého hráče polož krátké otázky k hernímu stylu. Povinně zjisti, co ho láká nejvíc: boj zblízka; střelba a stopování; kouzlení; plížení a zámky; léčení a pomoc; hudba, charisma a podpora ostatních.</w:t>
+      </w:r>
+    </w:p>
+    <w:p>
+      <w:pPr>
+        <w:spacing w:after="40"/>
+        <w:widowControl/>
+      </w:pPr>
+      <w:r>
+        <w:t>3. Na základě odpovědí doporuč rasu a jedno z šesti povolání. Povolání vždy pojmenuj a nech hráče výslovně potvrdit nebo změnit. Pokud si není jistý, stručně nabídni všech šest: Bojovník, Hraničář, Kouzelník, Zloděj, Léčitel, Bard.</w:t>
+      </w:r>
+    </w:p>
+    <w:p>
+      <w:pPr>
+        <w:spacing w:after="40"/>
+        <w:widowControl/>
+      </w:pPr>
+      <w:r>
+        <w:t>4. Stejně potvrď rasu. U člověka nech hráče zvolit jednu silnou a jednu jinou slabou vlastnost; u ostatních ras jsou silná a slabá vlastnost pevně dané tabulkou.</w:t>
+      </w:r>
+    </w:p>
+    <w:p>
+      <w:pPr>
+        <w:spacing w:after="40"/>
+        <w:widowControl/>
+      </w:pPr>
+      <w:r>
+        <w:t>5. Hráč zvolí jméno postavy. Pohlaví, vzhled, hlas a povaha nemění mechanické hodnoty.</w:t>
+      </w:r>
+    </w:p>
+    <w:p>
+      <w:pPr>
+        <w:spacing w:after="40"/>
+        <w:widowControl/>
+      </w:pPr>
+      <w:r>
+        <w:t>6. Vypočítej základní hodnoty před tvorbovými hody: každá vlastnost začíná na 5, přičti rasu a povolání. Tyto hodnoty zatím nejsou konečné.</w:t>
+      </w:r>
+    </w:p>
+    <w:p>
+      <w:pPr>
+        <w:spacing w:after="40"/>
+        <w:widowControl/>
+      </w:pPr>
+      <w:r>
+        <w:t>7. Proveď všech pět povinných tvorbových virtuálních hodů podle kapitoly 2.1.1 – zvlášť pro S, O, CH, CHA a Š. Teprve jejich výsledky vytvoří konečné vlastnosti postavy.</w:t>
+      </w:r>
+    </w:p>
+    <w:p>
+      <w:pPr/>
       <w:r>
         <w:rPr>
           <w:b w:val="0"/>
         </w:rPr>
-        <w:t xml:space="preserve">1.   </w:t>
-      </w:r>
-      <w:r>
-        <w:t>Zjisti počet hráčů, jejich přibližný věk, požadovanou délku hry a oblíbený tón nebo téma.</w:t>
+        <w:t>8. Z konečných S, O a Š vypočítej maximální Ž = S + O + ⌈Š/2⌉ a BŠ = ⌈Š/3⌉. Konečné hodnoty používej pro všechny požadavky, útoky, obrany, magii a další odvozené výpočty.</w:t>
       </w:r>
     </w:p>
     <w:p>
-      <w:pPr>
-        <w:spacing w:after="40"/>
-        <w:widowControl/>
-      </w:pPr>
+      <w:pPr/>
       <w:r>
         <w:rPr>
           <w:b w:val="0"/>
         </w:rPr>
-        <w:t xml:space="preserve">2.   </w:t>
-      </w:r>
-      <w:r>
-        <w:t>U tvorby postavy polož 3–5 krátkých otázek: jak chce hráč řešit nebezpečí, zda chce bojovat/kouzlit/pomáhat/plížit se/bavit ostatní a jaký typ hrdiny se mu líbí.</w:t>
+        <w:t>9. Přiřaď a stručně vysvětli rasovou schopnost a schopnost povolání.</w:t>
       </w:r>
     </w:p>
     <w:p>
-      <w:pPr>
-        <w:spacing w:after="40"/>
-        <w:widowControl/>
-      </w:pPr>
+      <w:pPr/>
       <w:r>
         <w:rPr>
           <w:b w:val="0"/>
         </w:rPr>
-        <w:t xml:space="preserve">3.   </w:t>
-      </w:r>
-      <w:r>
-        <w:t>Doporuč rasu a povolání, ale hráč je může kdykoli změnit nebo zvolit přímo.</w:t>
+        <w:t>10. Pokud je postava Kouzelník nebo Léčitel, otevři Magii a katalog kouzel a proveď povinný výběr počátečních známých kouzel podle jeho pravidel. Ostatní povolání začínají bez známých kouzel.</w:t>
       </w:r>
     </w:p>
     <w:p>
-      <w:pPr>
-        <w:spacing w:after="40"/>
-        <w:widowControl/>
-      </w:pPr>
+      <w:pPr/>
       <w:r>
         <w:rPr>
           <w:b w:val="0"/>
         </w:rPr>
-        <w:t xml:space="preserve">4.   </w:t>
-      </w:r>
-      <w:r>
-        <w:t>U více hráčů polož jednu otázku všem, nech odpovědět všechny a teprve potom pokračuj další otázkou.</w:t>
+        <w:t>11. Otevři Katalog vybavení a načti přesnou počáteční sestavu daného povolání. Nabídni doporučenou sestavu a všechny výslovně povolené volby nebo záměny. Hráč musí sestavu potvrdit nebo zvolit povolenou alternativu.</w:t>
       </w:r>
     </w:p>
     <w:p>
-      <w:pPr>
-        <w:spacing w:after="40"/>
-        <w:widowControl/>
-      </w:pPr>
+      <w:pPr/>
       <w:r>
         <w:rPr>
           <w:b w:val="0"/>
         </w:rPr>
-        <w:t xml:space="preserve">5.   </w:t>
-      </w:r>
-      <w:r>
-        <w:t>Hráč zvolí jméno. Pohlaví, vzhled, hlas a povaha nemění mechanické hodnoty.</w:t>
+        <w:t>12. Zkontroluj kompletní postavu: rasa, povolání, silná/slabá vlastnost, pět konečných vlastností, Ž, BŠ, obě schopnosti, známá kouzla, aktivní i nesené vybavení, peníze a případné další počáteční položky.</w:t>
       </w:r>
     </w:p>
     <w:p>
-      <w:pPr>
-        <w:spacing w:after="40"/>
-        <w:widowControl/>
-      </w:pPr>
+      <w:pPr/>
       <w:r>
         <w:rPr>
           <w:b w:val="0"/>
         </w:rPr>
-        <w:t xml:space="preserve">6.   </w:t>
-      </w:r>
-      <w:r>
-        <w:t>Vaelor vypočítá statistiky, Ž, silnou/slabou vlastnost a přiřadí rasovou i povolání schopnost.</w:t>
+        <w:t>13. Shrň kompletní postavu v několika krátkých řádcích a požádej hráče o potvrzení. Podrobné výpočty zobraz jen na požádání, ale interně je vždy uchovej.</w:t>
       </w:r>
     </w:p>
     <w:p>
-      <w:pPr>
-        <w:spacing w:after="40"/>
-        <w:widowControl/>
-      </w:pPr>
+      <w:pPr/>
       <w:r>
         <w:rPr>
           <w:b w:val="0"/>
         </w:rPr>
-        <w:t xml:space="preserve">7.   </w:t>
+        <w:t>14. Teprve když jsou všechny postavy kompletní a potvrzené, smí Vaelor zahájit první scénu dobrodružství.</w:t>
       </w:r>
+    </w:p>
+    <w:p>
+      <w:pPr/>
       <w:r>
-        <w:t>Nakonec shrň postavu v několika krátkých řádcích; podrobné výpočty ukaž jen na požádání.</w:t>
+        <w:rPr>
+          <w:b w:val="0"/>
+        </w:rPr>
+        <w:t>Při více hráčích může Vaelor společné otázky pokládat všem najednou, ale kompletní tvorbu každého hrdiny musí dokončit a zkontrolovat samostatně. Nikdo nesmí zůstat s neúplnou postavou.</w:t>
+      </w:r>
+    </w:p>
+    <w:p>
+      <w:pPr>
+        <w:pStyle w:val="Heading2"/>
+      </w:pPr>
+      <w:r>
+        <w:rPr>
+          <w:b w:val="0"/>
+        </w:rPr>
+        <w:t>2.1.1 Povinné tvorbové hody vlastností</w:t>
+      </w:r>
+    </w:p>
+    <w:p>
+      <w:pPr/>
+      <w:r>
+        <w:rPr>
+          <w:b w:val="0"/>
+        </w:rPr>
+        <w:t>Po výpočtu hodnot 5 + rasa + povolání provede každý nový hrdina pět samostatných tvorbových hodů – jeden pro každou vlastnost S, O, CH, CHA a Š. Tyto hody jsou součástí standardní tvorby postavy a nesmí být přeskočeny.</w:t>
+      </w:r>
+    </w:p>
+    <w:p>
+      <w:pPr/>
+      <w:r>
+        <w:rPr>
+          <w:b w:val="0"/>
+        </w:rPr>
+        <w:t>Pro každý z pěti hodů Vaelor: (1) určí kategorii dané vlastnosti – silná, normální nebo slabá; (2) tajně vytvoří novou nezávislou permutaci 1–6; (3) požádá hráče, aby řekl jedno číslo 1–6; (4) odhalí skutečný hod; (5) převede jej na bonus podle tabulky virtuální kostky; (6) bonus trvale přičte k základní hodnotě dané vlastnosti.</w:t>
+      </w:r>
+    </w:p>
+    <w:p>
+      <w:pPr/>
+      <w:r>
+        <w:rPr>
+          <w:b w:val="0"/>
+        </w:rPr>
+        <w:t>Převod je stejný jako u běžné virtuální kostky: silná 1→+1, 2→+2, 3→+3, 4→+4, 5→+5, 6→+6; normální 1–2→+1, 3–4→+2, 5–6→+3; slabá 1–3→+1, 4–6→+2.</w:t>
+      </w:r>
+    </w:p>
+    <w:p>
+      <w:pPr/>
+      <w:r>
+        <w:rPr>
+          <w:b w:val="0"/>
+        </w:rPr>
+        <w:t>Každá vlastnost používá nový náhodný rozklad. Jedno zvolené číslo se nesmí použít jako společný hod pro všech pět vlastností.</w:t>
+      </w:r>
+    </w:p>
+    <w:p>
+      <w:pPr/>
+      <w:r>
+        <w:rPr>
+          <w:b w:val="0"/>
+        </w:rPr>
+        <w:t>Konečná vlastnost = 5 + rasová úprava + úprava povolání + tvorbový bonus dané vlastnosti.</w:t>
+      </w:r>
+    </w:p>
+    <w:p>
+      <w:pPr/>
+      <w:r>
+        <w:rPr>
+          <w:b w:val="0"/>
+        </w:rPr>
+        <w:t>Konečné vlastnosti jsou trvalé počáteční hodnoty hrdiny. Z nich se teprve počítají Ž, BŠ, splnění požadavků vybavení a Min. CH kouzel. Kategorie silná/normální/slabá se tvorbovým hodem nemění.</w:t>
+      </w:r>
+    </w:p>
+    <w:p>
+      <w:pPr/>
+      <w:r>
+        <w:rPr>
+          <w:b w:val="0"/>
+        </w:rPr>
+        <w:t>Pokud hráč výslovně požádá o automaticky vytvořenou postavu, Vaelor může volby čísel 1–6 provést interně a náhodně, ale musí stále provést všech pět tvorbových hodů. Pouze u již hotové postavy se tvorbové hody neopakují.</w:t>
       </w:r>
     </w:p>
     <w:p>
@@ -1482,7 +1974,7 @@
         <w:widowControl/>
       </w:pPr>
       <w:r>
-        <w:t>Každá vlastnost začíná na 5. Základ je tedy 25 bodů. Rasové úpravy mají součet 0 a povolání přidává přesně +3, takže každá základní postava začíná celkem na 28 bodech.</w:t>
+        <w:t>Každá vlastnost začíná na 5. Základ je tedy 25 bodů. Rasové úpravy mají součet 0 a povolání přidává přesně +3, takže součet hodnot před tvorbovými hody je 28 bodů. Teprve povinné tvorbové hody z kapitoly 2.1.1 vytvoří konečné počáteční vlastnosti; konečný součet proto není pevně 28.</w:t>
       </w:r>
     </w:p>
     <w:p>
@@ -1499,18 +1991,19 @@
         <w:tblStyle w:val="TableGrid"/>
         <w:tblW w:type="auto" w:w="0"/>
         <w:jc w:val="center"/>
+        <w:tblLayout w:type="fixed"/>
         <w:tblLook w:firstColumn="1" w:firstRow="1" w:lastColumn="0" w:lastRow="0" w:noHBand="0" w:noVBand="1" w:val="04A0"/>
       </w:tblPr>
       <w:tblGrid>
-        <w:gridCol w:w="1109"/>
-        <w:gridCol w:w="1109"/>
-        <w:gridCol w:w="1109"/>
-        <w:gridCol w:w="1109"/>
-        <w:gridCol w:w="1109"/>
-        <w:gridCol w:w="1109"/>
-        <w:gridCol w:w="1109"/>
-        <w:gridCol w:w="1109"/>
-        <w:gridCol w:w="1109"/>
+        <w:gridCol w:w="1224"/>
+        <w:gridCol w:w="619"/>
+        <w:gridCol w:w="619"/>
+        <w:gridCol w:w="619"/>
+        <w:gridCol w:w="619"/>
+        <w:gridCol w:w="619"/>
+        <w:gridCol w:w="1080"/>
+        <w:gridCol w:w="1080"/>
+        <w:gridCol w:w="3499"/>
       </w:tblGrid>
       <w:tr>
         <w:trPr>
@@ -1519,7 +2012,7 @@
         </w:trPr>
         <w:tc>
           <w:tcPr>
-            <w:tcW w:type="dxa" w:w="1109"/>
+            <w:tcW w:type="dxa" w:w="1224"/>
             <w:vAlign w:val="center"/>
             <w:shd w:fill="20364F"/>
             <w:tcMar>
@@ -1548,7 +2041,7 @@
         </w:tc>
         <w:tc>
           <w:tcPr>
-            <w:tcW w:type="dxa" w:w="1109"/>
+            <w:tcW w:type="dxa" w:w="619"/>
             <w:vAlign w:val="center"/>
             <w:shd w:fill="20364F"/>
             <w:tcMar>
@@ -1577,7 +2070,7 @@
         </w:tc>
         <w:tc>
           <w:tcPr>
-            <w:tcW w:type="dxa" w:w="1109"/>
+            <w:tcW w:type="dxa" w:w="619"/>
             <w:vAlign w:val="center"/>
             <w:shd w:fill="20364F"/>
             <w:tcMar>
@@ -1606,7 +2099,7 @@
         </w:tc>
         <w:tc>
           <w:tcPr>
-            <w:tcW w:type="dxa" w:w="1109"/>
+            <w:tcW w:type="dxa" w:w="619"/>
             <w:vAlign w:val="center"/>
             <w:shd w:fill="20364F"/>
             <w:tcMar>
@@ -1635,7 +2128,7 @@
         </w:tc>
         <w:tc>
           <w:tcPr>
-            <w:tcW w:type="dxa" w:w="1109"/>
+            <w:tcW w:type="dxa" w:w="619"/>
             <w:vAlign w:val="center"/>
             <w:shd w:fill="20364F"/>
             <w:tcMar>
@@ -1664,7 +2157,7 @@
         </w:tc>
         <w:tc>
           <w:tcPr>
-            <w:tcW w:type="dxa" w:w="1109"/>
+            <w:tcW w:type="dxa" w:w="619"/>
             <w:vAlign w:val="center"/>
             <w:shd w:fill="20364F"/>
             <w:tcMar>
@@ -1693,7 +2186,7 @@
         </w:tc>
         <w:tc>
           <w:tcPr>
-            <w:tcW w:type="dxa" w:w="1109"/>
+            <w:tcW w:type="dxa" w:w="1080"/>
             <w:vAlign w:val="center"/>
             <w:shd w:fill="20364F"/>
             <w:tcMar>
@@ -1722,7 +2215,7 @@
         </w:tc>
         <w:tc>
           <w:tcPr>
-            <w:tcW w:type="dxa" w:w="1109"/>
+            <w:tcW w:type="dxa" w:w="1080"/>
             <w:vAlign w:val="center"/>
             <w:shd w:fill="20364F"/>
             <w:tcMar>
@@ -1751,7 +2244,7 @@
         </w:tc>
         <w:tc>
           <w:tcPr>
-            <w:tcW w:type="dxa" w:w="1109"/>
+            <w:tcW w:type="dxa" w:w="3499"/>
             <w:vAlign w:val="center"/>
             <w:shd w:fill="20364F"/>
             <w:tcMar>
@@ -1785,7 +2278,7 @@
         </w:trPr>
         <w:tc>
           <w:tcPr>
-            <w:tcW w:type="dxa" w:w="1109"/>
+            <w:tcW w:type="dxa" w:w="1224"/>
             <w:vAlign w:val="center"/>
             <w:tcMar>
               <w:top w:w="75" w:type="dxa"/>
@@ -1812,7 +2305,7 @@
         </w:tc>
         <w:tc>
           <w:tcPr>
-            <w:tcW w:type="dxa" w:w="1109"/>
+            <w:tcW w:type="dxa" w:w="619"/>
             <w:vAlign w:val="center"/>
             <w:tcMar>
               <w:top w:w="75" w:type="dxa"/>
@@ -1839,7 +2332,7 @@
         </w:tc>
         <w:tc>
           <w:tcPr>
-            <w:tcW w:type="dxa" w:w="1109"/>
+            <w:tcW w:type="dxa" w:w="619"/>
             <w:vAlign w:val="center"/>
             <w:tcMar>
               <w:top w:w="75" w:type="dxa"/>
@@ -1866,7 +2359,7 @@
         </w:tc>
         <w:tc>
           <w:tcPr>
-            <w:tcW w:type="dxa" w:w="1109"/>
+            <w:tcW w:type="dxa" w:w="619"/>
             <w:vAlign w:val="center"/>
             <w:tcMar>
               <w:top w:w="75" w:type="dxa"/>
@@ -1893,7 +2386,7 @@
         </w:tc>
         <w:tc>
           <w:tcPr>
-            <w:tcW w:type="dxa" w:w="1109"/>
+            <w:tcW w:type="dxa" w:w="619"/>
             <w:vAlign w:val="center"/>
             <w:tcMar>
               <w:top w:w="75" w:type="dxa"/>
@@ -1920,7 +2413,7 @@
         </w:tc>
         <w:tc>
           <w:tcPr>
-            <w:tcW w:type="dxa" w:w="1109"/>
+            <w:tcW w:type="dxa" w:w="619"/>
             <w:vAlign w:val="center"/>
             <w:tcMar>
               <w:top w:w="75" w:type="dxa"/>
@@ -1947,7 +2440,7 @@
         </w:tc>
         <w:tc>
           <w:tcPr>
-            <w:tcW w:type="dxa" w:w="1109"/>
+            <w:tcW w:type="dxa" w:w="1080"/>
             <w:vAlign w:val="center"/>
             <w:tcMar>
               <w:top w:w="75" w:type="dxa"/>
@@ -1974,7 +2467,7 @@
         </w:tc>
         <w:tc>
           <w:tcPr>
-            <w:tcW w:type="dxa" w:w="1109"/>
+            <w:tcW w:type="dxa" w:w="1080"/>
             <w:vAlign w:val="center"/>
             <w:tcMar>
               <w:top w:w="75" w:type="dxa"/>
@@ -2001,7 +2494,7 @@
         </w:tc>
         <w:tc>
           <w:tcPr>
-            <w:tcW w:type="dxa" w:w="1109"/>
+            <w:tcW w:type="dxa" w:w="3499"/>
             <w:vAlign w:val="center"/>
             <w:tcMar>
               <w:top w:w="75" w:type="dxa"/>
@@ -2033,7 +2526,7 @@
         </w:trPr>
         <w:tc>
           <w:tcPr>
-            <w:tcW w:type="dxa" w:w="1109"/>
+            <w:tcW w:type="dxa" w:w="1224"/>
             <w:vAlign w:val="center"/>
             <w:shd w:fill="F6F8FA"/>
             <w:tcMar>
@@ -2061,7 +2554,7 @@
         </w:tc>
         <w:tc>
           <w:tcPr>
-            <w:tcW w:type="dxa" w:w="1109"/>
+            <w:tcW w:type="dxa" w:w="619"/>
             <w:vAlign w:val="center"/>
             <w:shd w:fill="F6F8FA"/>
             <w:tcMar>
@@ -2089,7 +2582,7 @@
         </w:tc>
         <w:tc>
           <w:tcPr>
-            <w:tcW w:type="dxa" w:w="1109"/>
+            <w:tcW w:type="dxa" w:w="619"/>
             <w:vAlign w:val="center"/>
             <w:shd w:fill="F6F8FA"/>
             <w:tcMar>
@@ -2117,7 +2610,7 @@
         </w:tc>
         <w:tc>
           <w:tcPr>
-            <w:tcW w:type="dxa" w:w="1109"/>
+            <w:tcW w:type="dxa" w:w="619"/>
             <w:vAlign w:val="center"/>
             <w:shd w:fill="F6F8FA"/>
             <w:tcMar>
@@ -2145,7 +2638,7 @@
         </w:tc>
         <w:tc>
           <w:tcPr>
-            <w:tcW w:type="dxa" w:w="1109"/>
+            <w:tcW w:type="dxa" w:w="619"/>
             <w:vAlign w:val="center"/>
             <w:shd w:fill="F6F8FA"/>
             <w:tcMar>
@@ -2173,7 +2666,7 @@
         </w:tc>
         <w:tc>
           <w:tcPr>
-            <w:tcW w:type="dxa" w:w="1109"/>
+            <w:tcW w:type="dxa" w:w="619"/>
             <w:vAlign w:val="center"/>
             <w:shd w:fill="F6F8FA"/>
             <w:tcMar>
@@ -2201,7 +2694,7 @@
         </w:tc>
         <w:tc>
           <w:tcPr>
-            <w:tcW w:type="dxa" w:w="1109"/>
+            <w:tcW w:type="dxa" w:w="1080"/>
             <w:vAlign w:val="center"/>
             <w:shd w:fill="F6F8FA"/>
             <w:tcMar>
@@ -2229,7 +2722,7 @@
         </w:tc>
         <w:tc>
           <w:tcPr>
-            <w:tcW w:type="dxa" w:w="1109"/>
+            <w:tcW w:type="dxa" w:w="1080"/>
             <w:vAlign w:val="center"/>
             <w:shd w:fill="F6F8FA"/>
             <w:tcMar>
@@ -2257,7 +2750,7 @@
         </w:tc>
         <w:tc>
           <w:tcPr>
-            <w:tcW w:type="dxa" w:w="1109"/>
+            <w:tcW w:type="dxa" w:w="3499"/>
             <w:vAlign w:val="center"/>
             <w:shd w:fill="F6F8FA"/>
             <w:tcMar>
@@ -2290,7 +2783,7 @@
         </w:trPr>
         <w:tc>
           <w:tcPr>
-            <w:tcW w:type="dxa" w:w="1109"/>
+            <w:tcW w:type="dxa" w:w="1224"/>
             <w:vAlign w:val="center"/>
             <w:tcMar>
               <w:top w:w="75" w:type="dxa"/>
@@ -2317,7 +2810,7 @@
         </w:tc>
         <w:tc>
           <w:tcPr>
-            <w:tcW w:type="dxa" w:w="1109"/>
+            <w:tcW w:type="dxa" w:w="619"/>
             <w:vAlign w:val="center"/>
             <w:tcMar>
               <w:top w:w="75" w:type="dxa"/>
@@ -2344,7 +2837,7 @@
         </w:tc>
         <w:tc>
           <w:tcPr>
-            <w:tcW w:type="dxa" w:w="1109"/>
+            <w:tcW w:type="dxa" w:w="619"/>
             <w:vAlign w:val="center"/>
             <w:tcMar>
               <w:top w:w="75" w:type="dxa"/>
@@ -2371,7 +2864,7 @@
         </w:tc>
         <w:tc>
           <w:tcPr>
-            <w:tcW w:type="dxa" w:w="1109"/>
+            <w:tcW w:type="dxa" w:w="619"/>
             <w:vAlign w:val="center"/>
             <w:tcMar>
               <w:top w:w="75" w:type="dxa"/>
@@ -2398,7 +2891,7 @@
         </w:tc>
         <w:tc>
           <w:tcPr>
-            <w:tcW w:type="dxa" w:w="1109"/>
+            <w:tcW w:type="dxa" w:w="619"/>
             <w:vAlign w:val="center"/>
             <w:tcMar>
               <w:top w:w="75" w:type="dxa"/>
@@ -2425,7 +2918,7 @@
         </w:tc>
         <w:tc>
           <w:tcPr>
-            <w:tcW w:type="dxa" w:w="1109"/>
+            <w:tcW w:type="dxa" w:w="619"/>
             <w:vAlign w:val="center"/>
             <w:tcMar>
               <w:top w:w="75" w:type="dxa"/>
@@ -2452,7 +2945,7 @@
         </w:tc>
         <w:tc>
           <w:tcPr>
-            <w:tcW w:type="dxa" w:w="1109"/>
+            <w:tcW w:type="dxa" w:w="1080"/>
             <w:vAlign w:val="center"/>
             <w:tcMar>
               <w:top w:w="75" w:type="dxa"/>
@@ -2479,7 +2972,7 @@
         </w:tc>
         <w:tc>
           <w:tcPr>
-            <w:tcW w:type="dxa" w:w="1109"/>
+            <w:tcW w:type="dxa" w:w="1080"/>
             <w:vAlign w:val="center"/>
             <w:tcMar>
               <w:top w:w="75" w:type="dxa"/>
@@ -2506,7 +2999,7 @@
         </w:tc>
         <w:tc>
           <w:tcPr>
-            <w:tcW w:type="dxa" w:w="1109"/>
+            <w:tcW w:type="dxa" w:w="3499"/>
             <w:vAlign w:val="center"/>
             <w:tcMar>
               <w:top w:w="75" w:type="dxa"/>
@@ -2538,7 +3031,7 @@
         </w:trPr>
         <w:tc>
           <w:tcPr>
-            <w:tcW w:type="dxa" w:w="1109"/>
+            <w:tcW w:type="dxa" w:w="1224"/>
             <w:vAlign w:val="center"/>
             <w:shd w:fill="F6F8FA"/>
             <w:tcMar>
@@ -2566,7 +3059,7 @@
         </w:tc>
         <w:tc>
           <w:tcPr>
-            <w:tcW w:type="dxa" w:w="1109"/>
+            <w:tcW w:type="dxa" w:w="619"/>
             <w:vAlign w:val="center"/>
             <w:shd w:fill="F6F8FA"/>
             <w:tcMar>
@@ -2594,7 +3087,7 @@
         </w:tc>
         <w:tc>
           <w:tcPr>
-            <w:tcW w:type="dxa" w:w="1109"/>
+            <w:tcW w:type="dxa" w:w="619"/>
             <w:vAlign w:val="center"/>
             <w:shd w:fill="F6F8FA"/>
             <w:tcMar>
@@ -2622,7 +3115,7 @@
         </w:tc>
         <w:tc>
           <w:tcPr>
-            <w:tcW w:type="dxa" w:w="1109"/>
+            <w:tcW w:type="dxa" w:w="619"/>
             <w:vAlign w:val="center"/>
             <w:shd w:fill="F6F8FA"/>
             <w:tcMar>
@@ -2650,7 +3143,7 @@
         </w:tc>
         <w:tc>
           <w:tcPr>
-            <w:tcW w:type="dxa" w:w="1109"/>
+            <w:tcW w:type="dxa" w:w="619"/>
             <w:vAlign w:val="center"/>
             <w:shd w:fill="F6F8FA"/>
             <w:tcMar>
@@ -2678,7 +3171,7 @@
         </w:tc>
         <w:tc>
           <w:tcPr>
-            <w:tcW w:type="dxa" w:w="1109"/>
+            <w:tcW w:type="dxa" w:w="619"/>
             <w:vAlign w:val="center"/>
             <w:shd w:fill="F6F8FA"/>
             <w:tcMar>
@@ -2706,7 +3199,7 @@
         </w:tc>
         <w:tc>
           <w:tcPr>
-            <w:tcW w:type="dxa" w:w="1109"/>
+            <w:tcW w:type="dxa" w:w="1080"/>
             <w:vAlign w:val="center"/>
             <w:shd w:fill="F6F8FA"/>
             <w:tcMar>
@@ -2734,7 +3227,7 @@
         </w:tc>
         <w:tc>
           <w:tcPr>
-            <w:tcW w:type="dxa" w:w="1109"/>
+            <w:tcW w:type="dxa" w:w="1080"/>
             <w:vAlign w:val="center"/>
             <w:shd w:fill="F6F8FA"/>
             <w:tcMar>
@@ -2762,7 +3255,7 @@
         </w:tc>
         <w:tc>
           <w:tcPr>
-            <w:tcW w:type="dxa" w:w="1109"/>
+            <w:tcW w:type="dxa" w:w="3499"/>
             <w:vAlign w:val="center"/>
             <w:shd w:fill="F6F8FA"/>
             <w:tcMar>
@@ -2795,7 +3288,7 @@
         </w:trPr>
         <w:tc>
           <w:tcPr>
-            <w:tcW w:type="dxa" w:w="1109"/>
+            <w:tcW w:type="dxa" w:w="1224"/>
             <w:vAlign w:val="center"/>
             <w:tcMar>
               <w:top w:w="75" w:type="dxa"/>
@@ -2822,7 +3315,7 @@
         </w:tc>
         <w:tc>
           <w:tcPr>
-            <w:tcW w:type="dxa" w:w="1109"/>
+            <w:tcW w:type="dxa" w:w="619"/>
             <w:vAlign w:val="center"/>
             <w:tcMar>
               <w:top w:w="75" w:type="dxa"/>
@@ -2849,7 +3342,7 @@
         </w:tc>
         <w:tc>
           <w:tcPr>
-            <w:tcW w:type="dxa" w:w="1109"/>
+            <w:tcW w:type="dxa" w:w="619"/>
             <w:vAlign w:val="center"/>
             <w:tcMar>
               <w:top w:w="75" w:type="dxa"/>
@@ -2876,7 +3369,7 @@
         </w:tc>
         <w:tc>
           <w:tcPr>
-            <w:tcW w:type="dxa" w:w="1109"/>
+            <w:tcW w:type="dxa" w:w="619"/>
             <w:vAlign w:val="center"/>
             <w:tcMar>
               <w:top w:w="75" w:type="dxa"/>
@@ -2903,7 +3396,7 @@
         </w:tc>
         <w:tc>
           <w:tcPr>
-            <w:tcW w:type="dxa" w:w="1109"/>
+            <w:tcW w:type="dxa" w:w="619"/>
             <w:vAlign w:val="center"/>
             <w:tcMar>
               <w:top w:w="75" w:type="dxa"/>
@@ -2930,7 +3423,7 @@
         </w:tc>
         <w:tc>
           <w:tcPr>
-            <w:tcW w:type="dxa" w:w="1109"/>
+            <w:tcW w:type="dxa" w:w="619"/>
             <w:vAlign w:val="center"/>
             <w:tcMar>
               <w:top w:w="75" w:type="dxa"/>
@@ -2957,7 +3450,7 @@
         </w:tc>
         <w:tc>
           <w:tcPr>
-            <w:tcW w:type="dxa" w:w="1109"/>
+            <w:tcW w:type="dxa" w:w="1080"/>
             <w:vAlign w:val="center"/>
             <w:tcMar>
               <w:top w:w="75" w:type="dxa"/>
@@ -2984,7 +3477,7 @@
         </w:tc>
         <w:tc>
           <w:tcPr>
-            <w:tcW w:type="dxa" w:w="1109"/>
+            <w:tcW w:type="dxa" w:w="1080"/>
             <w:vAlign w:val="center"/>
             <w:tcMar>
               <w:top w:w="75" w:type="dxa"/>
@@ -3011,7 +3504,7 @@
         </w:tc>
         <w:tc>
           <w:tcPr>
-            <w:tcW w:type="dxa" w:w="1109"/>
+            <w:tcW w:type="dxa" w:w="3499"/>
             <w:vAlign w:val="center"/>
             <w:tcMar>
               <w:top w:w="75" w:type="dxa"/>
@@ -3033,6 +3526,254 @@
                 <w:sz w:val="15"/>
               </w:rPr>
               <w:t>Šťastlivec</w:t>
+            </w:r>
+          </w:p>
+        </w:tc>
+      </w:tr>
+      <w:tr>
+        <w:trPr>
+          <w:cantSplit/>
+        </w:trPr>
+        <w:tc>
+          <w:tcPr>
+            <w:tcW w:type="dxa" w:w="1224"/>
+            <w:vAlign w:val="center"/>
+            <w:tcMar>
+              <w:top w:w="75" w:type="dxa"/>
+              <w:left w:w="75" w:type="dxa"/>
+              <w:bottom w:w="75" w:type="dxa"/>
+              <w:right w:w="75" w:type="dxa"/>
+            </w:tcMar>
+          </w:tcPr>
+          <w:p>
+            <w:pPr>
+              <w:spacing w:after="0" w:before="0"/>
+              <w:jc w:val="center"/>
+            </w:pPr>
+            <w:r/>
+            <w:r>
+              <w:rPr>
+                <w:rFonts w:ascii="Liberation Sans" w:hAnsi="Liberation Sans" w:eastAsia="Liberation Sans"/>
+                <w:b w:val="0"/>
+                <w:sz w:val="15"/>
+              </w:rPr>
+              <w:t>Víla</w:t>
+            </w:r>
+          </w:p>
+        </w:tc>
+        <w:tc>
+          <w:tcPr>
+            <w:tcW w:type="dxa" w:w="619"/>
+            <w:vAlign w:val="center"/>
+            <w:tcMar>
+              <w:top w:w="75" w:type="dxa"/>
+              <w:left w:w="75" w:type="dxa"/>
+              <w:bottom w:w="75" w:type="dxa"/>
+              <w:right w:w="75" w:type="dxa"/>
+            </w:tcMar>
+          </w:tcPr>
+          <w:p>
+            <w:pPr>
+              <w:spacing w:after="0" w:before="0"/>
+              <w:jc w:val="center"/>
+            </w:pPr>
+            <w:r/>
+            <w:r>
+              <w:rPr>
+                <w:rFonts w:ascii="Liberation Sans" w:hAnsi="Liberation Sans" w:eastAsia="Liberation Sans"/>
+                <w:b w:val="0"/>
+                <w:sz w:val="15"/>
+              </w:rPr>
+              <w:t>−3</w:t>
+            </w:r>
+          </w:p>
+        </w:tc>
+        <w:tc>
+          <w:tcPr>
+            <w:tcW w:type="dxa" w:w="619"/>
+            <w:vAlign w:val="center"/>
+            <w:tcMar>
+              <w:top w:w="75" w:type="dxa"/>
+              <w:left w:w="75" w:type="dxa"/>
+              <w:bottom w:w="75" w:type="dxa"/>
+              <w:right w:w="75" w:type="dxa"/>
+            </w:tcMar>
+          </w:tcPr>
+          <w:p>
+            <w:pPr>
+              <w:spacing w:after="0" w:before="0"/>
+              <w:jc w:val="center"/>
+            </w:pPr>
+            <w:r/>
+            <w:r>
+              <w:rPr>
+                <w:rFonts w:ascii="Liberation Sans" w:hAnsi="Liberation Sans" w:eastAsia="Liberation Sans"/>
+                <w:b w:val="0"/>
+                <w:sz w:val="15"/>
+              </w:rPr>
+              <w:t>+1</w:t>
+            </w:r>
+          </w:p>
+        </w:tc>
+        <w:tc>
+          <w:tcPr>
+            <w:tcW w:type="dxa" w:w="619"/>
+            <w:vAlign w:val="center"/>
+            <w:tcMar>
+              <w:top w:w="75" w:type="dxa"/>
+              <w:left w:w="75" w:type="dxa"/>
+              <w:bottom w:w="75" w:type="dxa"/>
+              <w:right w:w="75" w:type="dxa"/>
+            </w:tcMar>
+          </w:tcPr>
+          <w:p>
+            <w:pPr>
+              <w:spacing w:after="0" w:before="0"/>
+              <w:jc w:val="center"/>
+            </w:pPr>
+            <w:r/>
+            <w:r>
+              <w:rPr>
+                <w:rFonts w:ascii="Liberation Sans" w:hAnsi="Liberation Sans" w:eastAsia="Liberation Sans"/>
+                <w:b w:val="0"/>
+                <w:sz w:val="15"/>
+              </w:rPr>
+              <w:t>+1</w:t>
+            </w:r>
+          </w:p>
+        </w:tc>
+        <w:tc>
+          <w:tcPr>
+            <w:tcW w:type="dxa" w:w="619"/>
+            <w:vAlign w:val="center"/>
+            <w:tcMar>
+              <w:top w:w="75" w:type="dxa"/>
+              <w:left w:w="75" w:type="dxa"/>
+              <w:bottom w:w="75" w:type="dxa"/>
+              <w:right w:w="75" w:type="dxa"/>
+            </w:tcMar>
+          </w:tcPr>
+          <w:p>
+            <w:pPr>
+              <w:spacing w:after="0" w:before="0"/>
+              <w:jc w:val="center"/>
+            </w:pPr>
+            <w:r/>
+            <w:r>
+              <w:rPr>
+                <w:rFonts w:ascii="Liberation Sans" w:hAnsi="Liberation Sans" w:eastAsia="Liberation Sans"/>
+                <w:b w:val="0"/>
+                <w:sz w:val="15"/>
+              </w:rPr>
+              <w:t>0</w:t>
+            </w:r>
+          </w:p>
+        </w:tc>
+        <w:tc>
+          <w:tcPr>
+            <w:tcW w:type="dxa" w:w="619"/>
+            <w:vAlign w:val="center"/>
+            <w:tcMar>
+              <w:top w:w="75" w:type="dxa"/>
+              <w:left w:w="75" w:type="dxa"/>
+              <w:bottom w:w="75" w:type="dxa"/>
+              <w:right w:w="75" w:type="dxa"/>
+            </w:tcMar>
+          </w:tcPr>
+          <w:p>
+            <w:pPr>
+              <w:spacing w:after="0" w:before="0"/>
+              <w:jc w:val="center"/>
+            </w:pPr>
+            <w:r/>
+            <w:r>
+              <w:rPr>
+                <w:rFonts w:ascii="Liberation Sans" w:hAnsi="Liberation Sans" w:eastAsia="Liberation Sans"/>
+                <w:b w:val="0"/>
+                <w:sz w:val="15"/>
+              </w:rPr>
+              <w:t>+1</w:t>
+            </w:r>
+          </w:p>
+        </w:tc>
+        <w:tc>
+          <w:tcPr>
+            <w:tcW w:type="dxa" w:w="1080"/>
+            <w:vAlign w:val="center"/>
+            <w:tcMar>
+              <w:top w:w="75" w:type="dxa"/>
+              <w:left w:w="75" w:type="dxa"/>
+              <w:bottom w:w="75" w:type="dxa"/>
+              <w:right w:w="75" w:type="dxa"/>
+            </w:tcMar>
+          </w:tcPr>
+          <w:p>
+            <w:pPr>
+              <w:spacing w:after="0" w:before="0"/>
+              <w:jc w:val="center"/>
+            </w:pPr>
+            <w:r/>
+            <w:r>
+              <w:rPr>
+                <w:rFonts w:ascii="Liberation Sans" w:hAnsi="Liberation Sans" w:eastAsia="Liberation Sans"/>
+                <w:b w:val="0"/>
+                <w:sz w:val="15"/>
+              </w:rPr>
+              <w:t>CH</w:t>
+            </w:r>
+          </w:p>
+        </w:tc>
+        <w:tc>
+          <w:tcPr>
+            <w:tcW w:type="dxa" w:w="1080"/>
+            <w:vAlign w:val="center"/>
+            <w:tcMar>
+              <w:top w:w="75" w:type="dxa"/>
+              <w:left w:w="75" w:type="dxa"/>
+              <w:bottom w:w="75" w:type="dxa"/>
+              <w:right w:w="75" w:type="dxa"/>
+            </w:tcMar>
+          </w:tcPr>
+          <w:p>
+            <w:pPr>
+              <w:spacing w:after="0" w:before="0"/>
+              <w:jc w:val="center"/>
+            </w:pPr>
+            <w:r/>
+            <w:r>
+              <w:rPr>
+                <w:rFonts w:ascii="Liberation Sans" w:hAnsi="Liberation Sans" w:eastAsia="Liberation Sans"/>
+                <w:b w:val="0"/>
+                <w:sz w:val="15"/>
+              </w:rPr>
+              <w:t>S</w:t>
+            </w:r>
+          </w:p>
+        </w:tc>
+        <w:tc>
+          <w:tcPr>
+            <w:tcW w:type="dxa" w:w="3499"/>
+            <w:vAlign w:val="center"/>
+            <w:tcMar>
+              <w:top w:w="75" w:type="dxa"/>
+              <w:left w:w="75" w:type="dxa"/>
+              <w:bottom w:w="75" w:type="dxa"/>
+              <w:right w:w="75" w:type="dxa"/>
+            </w:tcMar>
+          </w:tcPr>
+          <w:p>
+            <w:pPr>
+              <w:spacing w:after="0" w:before="0"/>
+              <w:jc w:val="center"/>
+            </w:pPr>
+            <w:r/>
+            <w:r>
+              <w:rPr>
+                <w:rFonts w:ascii="Liberation Sans" w:hAnsi="Liberation Sans" w:eastAsia="Liberation Sans"/>
+                <w:b w:val="0"/>
+                <w:sz w:val="15"/>
+              </w:rPr>
+              <w:t>Vílí prach</w:t>
             </w:r>
           </w:p>
         </w:tc>
@@ -3431,6 +4172,65 @@
                 <w:sz w:val="16"/>
               </w:rPr>
               <w:t>1× za dobrodružství po vlastním neúspěšném virtuálním hodu změní výsledek na těsný úspěch. Hod se neopakuje; jde o nejnižší nutný úspěch bez dodatečné výhody.</w:t>
+            </w:r>
+          </w:p>
+        </w:tc>
+      </w:tr>
+      <w:tr>
+        <w:trPr>
+          <w:cantSplit/>
+        </w:trPr>
+        <w:tc>
+          <w:tcPr>
+            <w:tcW w:type="dxa" w:w="2381"/>
+            <w:vAlign w:val="center"/>
+            <w:tcMar>
+              <w:top w:w="75" w:type="dxa"/>
+              <w:left w:w="75" w:type="dxa"/>
+              <w:bottom w:w="75" w:type="dxa"/>
+              <w:right w:w="75" w:type="dxa"/>
+            </w:tcMar>
+          </w:tcPr>
+          <w:p>
+            <w:pPr>
+              <w:spacing w:after="0" w:before="0"/>
+              <w:jc w:val="left"/>
+            </w:pPr>
+            <w:r/>
+            <w:r>
+              <w:rPr>
+                <w:rFonts w:ascii="Liberation Sans" w:hAnsi="Liberation Sans" w:eastAsia="Liberation Sans"/>
+                <w:b w:val="0"/>
+                <w:sz w:val="16"/>
+              </w:rPr>
+              <w:t>Víla – Vílí prach</w:t>
+            </w:r>
+          </w:p>
+        </w:tc>
+        <w:tc>
+          <w:tcPr>
+            <w:tcW w:type="dxa" w:w="7030"/>
+            <w:vAlign w:val="center"/>
+            <w:tcMar>
+              <w:top w:w="75" w:type="dxa"/>
+              <w:left w:w="75" w:type="dxa"/>
+              <w:bottom w:w="75" w:type="dxa"/>
+              <w:right w:w="75" w:type="dxa"/>
+            </w:tcMar>
+          </w:tcPr>
+          <w:p>
+            <w:pPr>
+              <w:spacing w:after="0" w:before="0"/>
+              <w:jc w:val="left"/>
+            </w:pPr>
+            <w:r/>
+            <w:r>
+              <w:rPr>
+                <w:rFonts w:ascii="Liberation Sans" w:hAnsi="Liberation Sans" w:eastAsia="Liberation Sans"/>
+                <w:b w:val="0"/>
+                <w:sz w:val="16"/>
+              </w:rPr>
+              <w:t>Každé léčení provedené vílou obnoví o 1 Ž navíc.</w:t>
             </w:r>
           </w:p>
         </w:tc>
@@ -5358,7 +6158,7 @@
         <w:widowControl/>
       </w:pPr>
       <w:r>
-        <w:t>Maximální Ž = S + O + ⌈Š/2⌉. Rasa ani povolání nepřidávají žádný další přímý bonus k Ž.</w:t>
+        <w:t>Maximální Ž = S + O + ⌈Š/2⌉. Používají se konečné vlastnosti po tvorbových hodech. Rasa ani povolání nepřidávají žádný další přímý bonus k Ž.</w:t>
       </w:r>
     </w:p>
     <w:p>
@@ -5405,7 +6205,7 @@
         <w:widowControl/>
       </w:pPr>
       <w:r>
-        <w:t>2.9 Kontrolní matice 30 základních kombinací</w:t>
+        <w:t>2.9 Kontrolní matice 36 kombinací před tvorbovými hody</w:t>
       </w:r>
     </w:p>
     <w:tbl>
@@ -5413,15 +6213,17 @@
         <w:tblStyle w:val="TableGrid"/>
         <w:tblW w:type="auto" w:w="0"/>
         <w:jc w:val="center"/>
+        <w:tblLayout w:type="fixed"/>
         <w:tblLook w:firstColumn="1" w:firstRow="1" w:lastColumn="0" w:lastRow="0" w:noHBand="0" w:noVBand="1" w:val="04A0"/>
       </w:tblPr>
       <w:tblGrid>
-        <w:gridCol w:w="1663"/>
-        <w:gridCol w:w="1663"/>
-        <w:gridCol w:w="1663"/>
-        <w:gridCol w:w="1663"/>
-        <w:gridCol w:w="1663"/>
-        <w:gridCol w:w="1663"/>
+        <w:gridCol w:w="1512"/>
+        <w:gridCol w:w="1411"/>
+        <w:gridCol w:w="1411"/>
+        <w:gridCol w:w="1411"/>
+        <w:gridCol w:w="1411"/>
+        <w:gridCol w:w="1411"/>
+        <w:gridCol w:w="1411"/>
       </w:tblGrid>
       <w:tr>
         <w:trPr>
@@ -5430,7 +6232,7 @@
         </w:trPr>
         <w:tc>
           <w:tcPr>
-            <w:tcW w:type="dxa" w:w="1663"/>
+            <w:tcW w:type="dxa" w:w="1512"/>
             <w:vAlign w:val="center"/>
             <w:shd w:fill="20364F"/>
             <w:tcMar>
@@ -5459,7 +6261,7 @@
         </w:tc>
         <w:tc>
           <w:tcPr>
-            <w:tcW w:type="dxa" w:w="1663"/>
+            <w:tcW w:type="dxa" w:w="1411"/>
             <w:vAlign w:val="center"/>
             <w:shd w:fill="20364F"/>
             <w:tcMar>
@@ -5488,7 +6290,7 @@
         </w:tc>
         <w:tc>
           <w:tcPr>
-            <w:tcW w:type="dxa" w:w="1663"/>
+            <w:tcW w:type="dxa" w:w="1411"/>
             <w:vAlign w:val="center"/>
             <w:shd w:fill="20364F"/>
             <w:tcMar>
@@ -5517,7 +6319,7 @@
         </w:tc>
         <w:tc>
           <w:tcPr>
-            <w:tcW w:type="dxa" w:w="1663"/>
+            <w:tcW w:type="dxa" w:w="1411"/>
             <w:vAlign w:val="center"/>
             <w:shd w:fill="20364F"/>
             <w:tcMar>
@@ -5546,7 +6348,7 @@
         </w:tc>
         <w:tc>
           <w:tcPr>
-            <w:tcW w:type="dxa" w:w="1663"/>
+            <w:tcW w:type="dxa" w:w="1411"/>
             <w:vAlign w:val="center"/>
             <w:shd w:fill="20364F"/>
             <w:tcMar>
@@ -5575,7 +6377,7 @@
         </w:tc>
         <w:tc>
           <w:tcPr>
-            <w:tcW w:type="dxa" w:w="1663"/>
+            <w:tcW w:type="dxa" w:w="1411"/>
             <w:vAlign w:val="center"/>
             <w:shd w:fill="20364F"/>
             <w:tcMar>
@@ -5602,6 +6404,35 @@
             </w:r>
           </w:p>
         </w:tc>
+        <w:tc>
+          <w:tcPr>
+            <w:tcW w:type="dxa" w:w="1411"/>
+            <w:vAlign w:val="center"/>
+            <w:shd w:fill="20364F"/>
+            <w:tcMar>
+              <w:top w:w="75" w:type="dxa"/>
+              <w:left w:w="75" w:type="dxa"/>
+              <w:bottom w:w="75" w:type="dxa"/>
+              <w:right w:w="75" w:type="dxa"/>
+            </w:tcMar>
+          </w:tcPr>
+          <w:p>
+            <w:pPr>
+              <w:spacing w:after="0" w:before="0"/>
+              <w:jc w:val="center"/>
+            </w:pPr>
+            <w:r/>
+            <w:r>
+              <w:rPr>
+                <w:rFonts w:ascii="Liberation Sans" w:hAnsi="Liberation Sans" w:eastAsia="Liberation Sans"/>
+                <w:b/>
+                <w:color w:val="FFFFFF"/>
+                <w:sz w:val="14"/>
+              </w:rPr>
+              <w:t>Víla</w:t>
+            </w:r>
+          </w:p>
+        </w:tc>
       </w:tr>
       <w:tr>
         <w:trPr>
@@ -5609,7 +6440,7 @@
         </w:trPr>
         <w:tc>
           <w:tcPr>
-            <w:tcW w:type="dxa" w:w="1663"/>
+            <w:tcW w:type="dxa" w:w="1512"/>
             <w:vAlign w:val="center"/>
             <w:tcMar>
               <w:top w:w="75" w:type="dxa"/>
@@ -5636,7 +6467,7 @@
         </w:tc>
         <w:tc>
           <w:tcPr>
-            <w:tcW w:type="dxa" w:w="1663"/>
+            <w:tcW w:type="dxa" w:w="1411"/>
             <w:vAlign w:val="center"/>
             <w:tcMar>
               <w:top w:w="75" w:type="dxa"/>
@@ -5646,24 +6477,14 @@
             </w:tcMar>
           </w:tcPr>
           <w:p>
-            <w:pPr>
-              <w:spacing w:after="0" w:before="0"/>
-              <w:jc w:val="left"/>
-            </w:pPr>
-            <w:r/>
-            <w:r>
-              <w:rPr>
-                <w:rFonts w:ascii="Liberation Sans" w:hAnsi="Liberation Sans" w:eastAsia="Liberation Sans"/>
-                <w:b w:val="0"/>
-                <w:sz w:val="14"/>
-              </w:rPr>
-              <w:t>7/6/5/5/5 • Ž16</w:t>
-            </w:r>
-          </w:p>
-        </w:tc>
-        <w:tc>
-          <w:tcPr>
-            <w:tcW w:type="dxa" w:w="1663"/>
+            <w:r>
+              <w:t>7/6/5/5/5</w:t>
+            </w:r>
+          </w:p>
+        </w:tc>
+        <w:tc>
+          <w:tcPr>
+            <w:tcW w:type="dxa" w:w="1411"/>
             <w:vAlign w:val="center"/>
             <w:tcMar>
               <w:top w:w="75" w:type="dxa"/>
@@ -5673,24 +6494,14 @@
             </w:tcMar>
           </w:tcPr>
           <w:p>
-            <w:pPr>
-              <w:spacing w:after="0" w:before="0"/>
-              <w:jc w:val="left"/>
-            </w:pPr>
-            <w:r/>
-            <w:r>
-              <w:rPr>
-                <w:rFonts w:ascii="Liberation Sans" w:hAnsi="Liberation Sans" w:eastAsia="Liberation Sans"/>
-                <w:b w:val="0"/>
-                <w:sz w:val="14"/>
-              </w:rPr>
-              <w:t>6/7/7/4/4 • Ž15</w:t>
-            </w:r>
-          </w:p>
-        </w:tc>
-        <w:tc>
-          <w:tcPr>
-            <w:tcW w:type="dxa" w:w="1663"/>
+            <w:r>
+              <w:t>6/7/7/4/4</w:t>
+            </w:r>
+          </w:p>
+        </w:tc>
+        <w:tc>
+          <w:tcPr>
+            <w:tcW w:type="dxa" w:w="1411"/>
             <w:vAlign w:val="center"/>
             <w:tcMar>
               <w:top w:w="75" w:type="dxa"/>
@@ -5700,24 +6511,14 @@
             </w:tcMar>
           </w:tcPr>
           <w:p>
-            <w:pPr>
-              <w:spacing w:after="0" w:before="0"/>
-              <w:jc w:val="left"/>
-            </w:pPr>
-            <w:r/>
-            <w:r>
-              <w:rPr>
-                <w:rFonts w:ascii="Liberation Sans" w:hAnsi="Liberation Sans" w:eastAsia="Liberation Sans"/>
-                <w:b w:val="0"/>
-                <w:sz w:val="14"/>
-              </w:rPr>
-              <w:t>9/5/5/4/5 • Ž17</w:t>
-            </w:r>
-          </w:p>
-        </w:tc>
-        <w:tc>
-          <w:tcPr>
-            <w:tcW w:type="dxa" w:w="1663"/>
+            <w:r>
+              <w:t>9/5/5/4/5</w:t>
+            </w:r>
+          </w:p>
+        </w:tc>
+        <w:tc>
+          <w:tcPr>
+            <w:tcW w:type="dxa" w:w="1411"/>
             <w:vAlign w:val="center"/>
             <w:tcMar>
               <w:top w:w="75" w:type="dxa"/>
@@ -5727,24 +6528,14 @@
             </w:tcMar>
           </w:tcPr>
           <w:p>
-            <w:pPr>
-              <w:spacing w:after="0" w:before="0"/>
-              <w:jc w:val="left"/>
-            </w:pPr>
-            <w:r/>
-            <w:r>
-              <w:rPr>
-                <w:rFonts w:ascii="Liberation Sans" w:hAnsi="Liberation Sans" w:eastAsia="Liberation Sans"/>
-                <w:b w:val="0"/>
-                <w:sz w:val="14"/>
-              </w:rPr>
-              <w:t>10/6/4/4/4 • Ž18</w:t>
-            </w:r>
-          </w:p>
-        </w:tc>
-        <w:tc>
-          <w:tcPr>
-            <w:tcW w:type="dxa" w:w="1663"/>
+            <w:r>
+              <w:t>10/6/4/4/4</w:t>
+            </w:r>
+          </w:p>
+        </w:tc>
+        <w:tc>
+          <w:tcPr>
+            <w:tcW w:type="dxa" w:w="1411"/>
             <w:vAlign w:val="center"/>
             <w:tcMar>
               <w:top w:w="75" w:type="dxa"/>
@@ -5754,18 +6545,25 @@
             </w:tcMar>
           </w:tcPr>
           <w:p>
-            <w:pPr>
-              <w:spacing w:after="0" w:before="0"/>
-              <w:jc w:val="left"/>
-            </w:pPr>
-            <w:r/>
-            <w:r>
-              <w:rPr>
-                <w:rFonts w:ascii="Liberation Sans" w:hAnsi="Liberation Sans" w:eastAsia="Liberation Sans"/>
-                <w:b w:val="0"/>
-                <w:sz w:val="14"/>
-              </w:rPr>
-              <w:t>4/7/5/5/7 • Ž15</w:t>
+            <w:r>
+              <w:t>4/7/5/5/7</w:t>
+            </w:r>
+          </w:p>
+        </w:tc>
+        <w:tc>
+          <w:tcPr>
+            <w:tcW w:type="dxa" w:w="1411"/>
+            <w:vAlign w:val="center"/>
+            <w:tcMar>
+              <w:top w:w="75" w:type="dxa"/>
+              <w:left w:w="75" w:type="dxa"/>
+              <w:bottom w:w="75" w:type="dxa"/>
+              <w:right w:w="75" w:type="dxa"/>
+            </w:tcMar>
+          </w:tcPr>
+          <w:p>
+            <w:r>
+              <w:t>4/7/6/5/6</w:t>
             </w:r>
           </w:p>
         </w:tc>
@@ -5776,7 +6574,7 @@
         </w:trPr>
         <w:tc>
           <w:tcPr>
-            <w:tcW w:type="dxa" w:w="1663"/>
+            <w:tcW w:type="dxa" w:w="1512"/>
             <w:vAlign w:val="center"/>
             <w:shd w:fill="F6F8FA"/>
             <w:tcMar>
@@ -5804,7 +6602,7 @@
         </w:tc>
         <w:tc>
           <w:tcPr>
-            <w:tcW w:type="dxa" w:w="1663"/>
+            <w:tcW w:type="dxa" w:w="1411"/>
             <w:vAlign w:val="center"/>
             <w:shd w:fill="F6F8FA"/>
             <w:tcMar>
@@ -5815,24 +6613,14 @@
             </w:tcMar>
           </w:tcPr>
           <w:p>
-            <w:pPr>
-              <w:spacing w:after="0" w:before="0"/>
-              <w:jc w:val="left"/>
-            </w:pPr>
-            <w:r/>
-            <w:r>
-              <w:rPr>
-                <w:rFonts w:ascii="Liberation Sans" w:hAnsi="Liberation Sans" w:eastAsia="Liberation Sans"/>
-                <w:b w:val="0"/>
-                <w:sz w:val="14"/>
-              </w:rPr>
-              <w:t>6/7/5/5/5 • Ž16</w:t>
-            </w:r>
-          </w:p>
-        </w:tc>
-        <w:tc>
-          <w:tcPr>
-            <w:tcW w:type="dxa" w:w="1663"/>
+            <w:r>
+              <w:t>6/7/5/5/5</w:t>
+            </w:r>
+          </w:p>
+        </w:tc>
+        <w:tc>
+          <w:tcPr>
+            <w:tcW w:type="dxa" w:w="1411"/>
             <w:vAlign w:val="center"/>
             <w:shd w:fill="F6F8FA"/>
             <w:tcMar>
@@ -5843,24 +6631,14 @@
             </w:tcMar>
           </w:tcPr>
           <w:p>
-            <w:pPr>
-              <w:spacing w:after="0" w:before="0"/>
-              <w:jc w:val="left"/>
-            </w:pPr>
-            <w:r/>
-            <w:r>
-              <w:rPr>
-                <w:rFonts w:ascii="Liberation Sans" w:hAnsi="Liberation Sans" w:eastAsia="Liberation Sans"/>
-                <w:b w:val="0"/>
-                <w:sz w:val="14"/>
-              </w:rPr>
-              <w:t>5/8/7/4/4 • Ž15</w:t>
-            </w:r>
-          </w:p>
-        </w:tc>
-        <w:tc>
-          <w:tcPr>
-            <w:tcW w:type="dxa" w:w="1663"/>
+            <w:r>
+              <w:t>5/8/7/4/4</w:t>
+            </w:r>
+          </w:p>
+        </w:tc>
+        <w:tc>
+          <w:tcPr>
+            <w:tcW w:type="dxa" w:w="1411"/>
             <w:vAlign w:val="center"/>
             <w:shd w:fill="F6F8FA"/>
             <w:tcMar>
@@ -5871,24 +6649,14 @@
             </w:tcMar>
           </w:tcPr>
           <w:p>
-            <w:pPr>
-              <w:spacing w:after="0" w:before="0"/>
-              <w:jc w:val="left"/>
-            </w:pPr>
-            <w:r/>
-            <w:r>
-              <w:rPr>
-                <w:rFonts w:ascii="Liberation Sans" w:hAnsi="Liberation Sans" w:eastAsia="Liberation Sans"/>
-                <w:b w:val="0"/>
-                <w:sz w:val="14"/>
-              </w:rPr>
-              <w:t>8/6/5/4/5 • Ž17</w:t>
-            </w:r>
-          </w:p>
-        </w:tc>
-        <w:tc>
-          <w:tcPr>
-            <w:tcW w:type="dxa" w:w="1663"/>
+            <w:r>
+              <w:t>8/6/5/4/5</w:t>
+            </w:r>
+          </w:p>
+        </w:tc>
+        <w:tc>
+          <w:tcPr>
+            <w:tcW w:type="dxa" w:w="1411"/>
             <w:vAlign w:val="center"/>
             <w:shd w:fill="F6F8FA"/>
             <w:tcMar>
@@ -5899,24 +6667,14 @@
             </w:tcMar>
           </w:tcPr>
           <w:p>
-            <w:pPr>
-              <w:spacing w:after="0" w:before="0"/>
-              <w:jc w:val="left"/>
-            </w:pPr>
-            <w:r/>
-            <w:r>
-              <w:rPr>
-                <w:rFonts w:ascii="Liberation Sans" w:hAnsi="Liberation Sans" w:eastAsia="Liberation Sans"/>
-                <w:b w:val="0"/>
-                <w:sz w:val="14"/>
-              </w:rPr>
-              <w:t>9/7/4/4/4 • Ž18</w:t>
-            </w:r>
-          </w:p>
-        </w:tc>
-        <w:tc>
-          <w:tcPr>
-            <w:tcW w:type="dxa" w:w="1663"/>
+            <w:r>
+              <w:t>9/7/4/4/4</w:t>
+            </w:r>
+          </w:p>
+        </w:tc>
+        <w:tc>
+          <w:tcPr>
+            <w:tcW w:type="dxa" w:w="1411"/>
             <w:vAlign w:val="center"/>
             <w:shd w:fill="F6F8FA"/>
             <w:tcMar>
@@ -5927,196 +6685,14 @@
             </w:tcMar>
           </w:tcPr>
           <w:p>
-            <w:pPr>
-              <w:spacing w:after="0" w:before="0"/>
-              <w:jc w:val="left"/>
-            </w:pPr>
-            <w:r/>
-            <w:r>
-              <w:rPr>
-                <w:rFonts w:ascii="Liberation Sans" w:hAnsi="Liberation Sans" w:eastAsia="Liberation Sans"/>
-                <w:b w:val="0"/>
-                <w:sz w:val="14"/>
-              </w:rPr>
-              <w:t>3/8/5/5/7 • Ž15</w:t>
-            </w:r>
-          </w:p>
-        </w:tc>
-      </w:tr>
-      <w:tr>
-        <w:trPr>
-          <w:cantSplit/>
-        </w:trPr>
-        <w:tc>
-          <w:tcPr>
-            <w:tcW w:type="dxa" w:w="1663"/>
-            <w:vAlign w:val="center"/>
-            <w:tcMar>
-              <w:top w:w="75" w:type="dxa"/>
-              <w:left w:w="75" w:type="dxa"/>
-              <w:bottom w:w="75" w:type="dxa"/>
-              <w:right w:w="75" w:type="dxa"/>
-            </w:tcMar>
-          </w:tcPr>
-          <w:p>
-            <w:pPr>
-              <w:spacing w:after="0" w:before="0"/>
-              <w:jc w:val="center"/>
-            </w:pPr>
-            <w:r/>
-            <w:r>
-              <w:rPr>
-                <w:rFonts w:ascii="Liberation Sans" w:hAnsi="Liberation Sans" w:eastAsia="Liberation Sans"/>
-                <w:b w:val="0"/>
-                <w:sz w:val="14"/>
-              </w:rPr>
-              <w:t>Kouzelník</w:t>
-            </w:r>
-          </w:p>
-        </w:tc>
-        <w:tc>
-          <w:tcPr>
-            <w:tcW w:type="dxa" w:w="1663"/>
-            <w:vAlign w:val="center"/>
-            <w:tcMar>
-              <w:top w:w="75" w:type="dxa"/>
-              <w:left w:w="75" w:type="dxa"/>
-              <w:bottom w:w="75" w:type="dxa"/>
-              <w:right w:w="75" w:type="dxa"/>
-            </w:tcMar>
-          </w:tcPr>
-          <w:p>
-            <w:pPr>
-              <w:spacing w:after="0" w:before="0"/>
-              <w:jc w:val="left"/>
-            </w:pPr>
-            <w:r/>
-            <w:r>
-              <w:rPr>
-                <w:rFonts w:ascii="Liberation Sans" w:hAnsi="Liberation Sans" w:eastAsia="Liberation Sans"/>
-                <w:b w:val="0"/>
-                <w:sz w:val="14"/>
-              </w:rPr>
-              <w:t>5/5/8/5/5 • Ž13</w:t>
-            </w:r>
-          </w:p>
-        </w:tc>
-        <w:tc>
-          <w:tcPr>
-            <w:tcW w:type="dxa" w:w="1663"/>
-            <w:vAlign w:val="center"/>
-            <w:tcMar>
-              <w:top w:w="75" w:type="dxa"/>
-              <w:left w:w="75" w:type="dxa"/>
-              <w:bottom w:w="75" w:type="dxa"/>
-              <w:right w:w="75" w:type="dxa"/>
-            </w:tcMar>
-          </w:tcPr>
-          <w:p>
-            <w:pPr>
-              <w:spacing w:after="0" w:before="0"/>
-              <w:jc w:val="left"/>
-            </w:pPr>
-            <w:r/>
-            <w:r>
-              <w:rPr>
-                <w:rFonts w:ascii="Liberation Sans" w:hAnsi="Liberation Sans" w:eastAsia="Liberation Sans"/>
-                <w:b w:val="0"/>
-                <w:sz w:val="14"/>
-              </w:rPr>
-              <w:t>4/6/10/4/4 • Ž12</w:t>
-            </w:r>
-          </w:p>
-        </w:tc>
-        <w:tc>
-          <w:tcPr>
-            <w:tcW w:type="dxa" w:w="1663"/>
-            <w:vAlign w:val="center"/>
-            <w:tcMar>
-              <w:top w:w="75" w:type="dxa"/>
-              <w:left w:w="75" w:type="dxa"/>
-              <w:bottom w:w="75" w:type="dxa"/>
-              <w:right w:w="75" w:type="dxa"/>
-            </w:tcMar>
-          </w:tcPr>
-          <w:p>
-            <w:pPr>
-              <w:spacing w:after="0" w:before="0"/>
-              <w:jc w:val="left"/>
-            </w:pPr>
-            <w:r/>
-            <w:r>
-              <w:rPr>
-                <w:rFonts w:ascii="Liberation Sans" w:hAnsi="Liberation Sans" w:eastAsia="Liberation Sans"/>
-                <w:b w:val="0"/>
-                <w:sz w:val="14"/>
-              </w:rPr>
-              <w:t>7/4/8/4/5 • Ž14</w:t>
-            </w:r>
-          </w:p>
-        </w:tc>
-        <w:tc>
-          <w:tcPr>
-            <w:tcW w:type="dxa" w:w="1663"/>
-            <w:vAlign w:val="center"/>
-            <w:tcMar>
-              <w:top w:w="75" w:type="dxa"/>
-              <w:left w:w="75" w:type="dxa"/>
-              <w:bottom w:w="75" w:type="dxa"/>
-              <w:right w:w="75" w:type="dxa"/>
-            </w:tcMar>
-          </w:tcPr>
-          <w:p>
-            <w:pPr>
-              <w:spacing w:after="0" w:before="0"/>
-              <w:jc w:val="left"/>
-            </w:pPr>
-            <w:r/>
-            <w:r>
-              <w:rPr>
-                <w:rFonts w:ascii="Liberation Sans" w:hAnsi="Liberation Sans" w:eastAsia="Liberation Sans"/>
-                <w:b w:val="0"/>
-                <w:sz w:val="14"/>
-              </w:rPr>
-              <w:t>8/5/7/4/4 • Ž15</w:t>
-            </w:r>
-          </w:p>
-        </w:tc>
-        <w:tc>
-          <w:tcPr>
-            <w:tcW w:type="dxa" w:w="1663"/>
-            <w:vAlign w:val="center"/>
-            <w:tcMar>
-              <w:top w:w="75" w:type="dxa"/>
-              <w:left w:w="75" w:type="dxa"/>
-              <w:bottom w:w="75" w:type="dxa"/>
-              <w:right w:w="75" w:type="dxa"/>
-            </w:tcMar>
-          </w:tcPr>
-          <w:p>
-            <w:pPr>
-              <w:spacing w:after="0" w:before="0"/>
-              <w:jc w:val="left"/>
-            </w:pPr>
-            <w:r/>
-            <w:r>
-              <w:rPr>
-                <w:rFonts w:ascii="Liberation Sans" w:hAnsi="Liberation Sans" w:eastAsia="Liberation Sans"/>
-                <w:b w:val="0"/>
-                <w:sz w:val="14"/>
-              </w:rPr>
-              <w:t>2/6/8/5/7 • Ž12</w:t>
-            </w:r>
-          </w:p>
-        </w:tc>
-      </w:tr>
-      <w:tr>
-        <w:trPr>
-          <w:cantSplit/>
-        </w:trPr>
-        <w:tc>
-          <w:tcPr>
-            <w:tcW w:type="dxa" w:w="1663"/>
+            <w:r>
+              <w:t>3/8/5/5/7</w:t>
+            </w:r>
+          </w:p>
+        </w:tc>
+        <w:tc>
+          <w:tcPr>
+            <w:tcW w:type="dxa" w:w="1411"/>
             <w:vAlign w:val="center"/>
             <w:shd w:fill="F6F8FA"/>
             <w:tcMar>
@@ -6127,6 +6703,28 @@
             </w:tcMar>
           </w:tcPr>
           <w:p>
+            <w:r>
+              <w:t>3/8/6/5/6</w:t>
+            </w:r>
+          </w:p>
+        </w:tc>
+      </w:tr>
+      <w:tr>
+        <w:trPr>
+          <w:cantSplit/>
+        </w:trPr>
+        <w:tc>
+          <w:tcPr>
+            <w:tcW w:type="dxa" w:w="1512"/>
+            <w:vAlign w:val="center"/>
+            <w:tcMar>
+              <w:top w:w="75" w:type="dxa"/>
+              <w:left w:w="75" w:type="dxa"/>
+              <w:bottom w:w="75" w:type="dxa"/>
+              <w:right w:w="75" w:type="dxa"/>
+            </w:tcMar>
+          </w:tcPr>
+          <w:p>
             <w:pPr>
               <w:spacing w:after="0" w:before="0"/>
               <w:jc w:val="center"/>
@@ -6138,13 +6736,120 @@
                 <w:b w:val="0"/>
                 <w:sz w:val="14"/>
               </w:rPr>
-              <w:t>Zloděj</w:t>
-            </w:r>
-          </w:p>
-        </w:tc>
-        <w:tc>
-          <w:tcPr>
-            <w:tcW w:type="dxa" w:w="1663"/>
+              <w:t>Kouzelník</w:t>
+            </w:r>
+          </w:p>
+        </w:tc>
+        <w:tc>
+          <w:tcPr>
+            <w:tcW w:type="dxa" w:w="1411"/>
+            <w:vAlign w:val="center"/>
+            <w:tcMar>
+              <w:top w:w="75" w:type="dxa"/>
+              <w:left w:w="75" w:type="dxa"/>
+              <w:bottom w:w="75" w:type="dxa"/>
+              <w:right w:w="75" w:type="dxa"/>
+            </w:tcMar>
+          </w:tcPr>
+          <w:p>
+            <w:r>
+              <w:t>5/5/8/5/5</w:t>
+            </w:r>
+          </w:p>
+        </w:tc>
+        <w:tc>
+          <w:tcPr>
+            <w:tcW w:type="dxa" w:w="1411"/>
+            <w:vAlign w:val="center"/>
+            <w:tcMar>
+              <w:top w:w="75" w:type="dxa"/>
+              <w:left w:w="75" w:type="dxa"/>
+              <w:bottom w:w="75" w:type="dxa"/>
+              <w:right w:w="75" w:type="dxa"/>
+            </w:tcMar>
+          </w:tcPr>
+          <w:p>
+            <w:r>
+              <w:t>4/6/10/4/4</w:t>
+            </w:r>
+          </w:p>
+        </w:tc>
+        <w:tc>
+          <w:tcPr>
+            <w:tcW w:type="dxa" w:w="1411"/>
+            <w:vAlign w:val="center"/>
+            <w:tcMar>
+              <w:top w:w="75" w:type="dxa"/>
+              <w:left w:w="75" w:type="dxa"/>
+              <w:bottom w:w="75" w:type="dxa"/>
+              <w:right w:w="75" w:type="dxa"/>
+            </w:tcMar>
+          </w:tcPr>
+          <w:p>
+            <w:r>
+              <w:t>7/4/8/4/5</w:t>
+            </w:r>
+          </w:p>
+        </w:tc>
+        <w:tc>
+          <w:tcPr>
+            <w:tcW w:type="dxa" w:w="1411"/>
+            <w:vAlign w:val="center"/>
+            <w:tcMar>
+              <w:top w:w="75" w:type="dxa"/>
+              <w:left w:w="75" w:type="dxa"/>
+              <w:bottom w:w="75" w:type="dxa"/>
+              <w:right w:w="75" w:type="dxa"/>
+            </w:tcMar>
+          </w:tcPr>
+          <w:p>
+            <w:r>
+              <w:t>8/5/7/4/4</w:t>
+            </w:r>
+          </w:p>
+        </w:tc>
+        <w:tc>
+          <w:tcPr>
+            <w:tcW w:type="dxa" w:w="1411"/>
+            <w:vAlign w:val="center"/>
+            <w:tcMar>
+              <w:top w:w="75" w:type="dxa"/>
+              <w:left w:w="75" w:type="dxa"/>
+              <w:bottom w:w="75" w:type="dxa"/>
+              <w:right w:w="75" w:type="dxa"/>
+            </w:tcMar>
+          </w:tcPr>
+          <w:p>
+            <w:r>
+              <w:t>2/6/8/5/7</w:t>
+            </w:r>
+          </w:p>
+        </w:tc>
+        <w:tc>
+          <w:tcPr>
+            <w:tcW w:type="dxa" w:w="1411"/>
+            <w:vAlign w:val="center"/>
+            <w:tcMar>
+              <w:top w:w="75" w:type="dxa"/>
+              <w:left w:w="75" w:type="dxa"/>
+              <w:bottom w:w="75" w:type="dxa"/>
+              <w:right w:w="75" w:type="dxa"/>
+            </w:tcMar>
+          </w:tcPr>
+          <w:p>
+            <w:r>
+              <w:t>2/6/9/5/6</w:t>
+            </w:r>
+          </w:p>
+        </w:tc>
+      </w:tr>
+      <w:tr>
+        <w:trPr>
+          <w:cantSplit/>
+        </w:trPr>
+        <w:tc>
+          <w:tcPr>
+            <w:tcW w:type="dxa" w:w="1512"/>
             <w:vAlign w:val="center"/>
             <w:shd w:fill="F6F8FA"/>
             <w:tcMar>
@@ -6157,7 +6862,7 @@
           <w:p>
             <w:pPr>
               <w:spacing w:after="0" w:before="0"/>
-              <w:jc w:val="left"/>
+              <w:jc w:val="center"/>
             </w:pPr>
             <w:r/>
             <w:r>
@@ -6166,13 +6871,13 @@
                 <w:b w:val="0"/>
                 <w:sz w:val="14"/>
               </w:rPr>
-              <w:t>5/7/5/5/6 • Ž15</w:t>
-            </w:r>
-          </w:p>
-        </w:tc>
-        <w:tc>
-          <w:tcPr>
-            <w:tcW w:type="dxa" w:w="1663"/>
+              <w:t>Zloděj</w:t>
+            </w:r>
+          </w:p>
+        </w:tc>
+        <w:tc>
+          <w:tcPr>
+            <w:tcW w:type="dxa" w:w="1411"/>
             <w:vAlign w:val="center"/>
             <w:shd w:fill="F6F8FA"/>
             <w:tcMar>
@@ -6183,24 +6888,14 @@
             </w:tcMar>
           </w:tcPr>
           <w:p>
-            <w:pPr>
-              <w:spacing w:after="0" w:before="0"/>
-              <w:jc w:val="left"/>
-            </w:pPr>
-            <w:r/>
-            <w:r>
-              <w:rPr>
-                <w:rFonts w:ascii="Liberation Sans" w:hAnsi="Liberation Sans" w:eastAsia="Liberation Sans"/>
-                <w:b w:val="0"/>
-                <w:sz w:val="14"/>
-              </w:rPr>
-              <w:t>4/8/7/4/5 • Ž15</w:t>
-            </w:r>
-          </w:p>
-        </w:tc>
-        <w:tc>
-          <w:tcPr>
-            <w:tcW w:type="dxa" w:w="1663"/>
+            <w:r>
+              <w:t>5/7/5/5/6</w:t>
+            </w:r>
+          </w:p>
+        </w:tc>
+        <w:tc>
+          <w:tcPr>
+            <w:tcW w:type="dxa" w:w="1411"/>
             <w:vAlign w:val="center"/>
             <w:shd w:fill="F6F8FA"/>
             <w:tcMar>
@@ -6211,24 +6906,14 @@
             </w:tcMar>
           </w:tcPr>
           <w:p>
-            <w:pPr>
-              <w:spacing w:after="0" w:before="0"/>
-              <w:jc w:val="left"/>
-            </w:pPr>
-            <w:r/>
-            <w:r>
-              <w:rPr>
-                <w:rFonts w:ascii="Liberation Sans" w:hAnsi="Liberation Sans" w:eastAsia="Liberation Sans"/>
-                <w:b w:val="0"/>
-                <w:sz w:val="14"/>
-              </w:rPr>
-              <w:t>7/6/5/4/6 • Ž16</w:t>
-            </w:r>
-          </w:p>
-        </w:tc>
-        <w:tc>
-          <w:tcPr>
-            <w:tcW w:type="dxa" w:w="1663"/>
+            <w:r>
+              <w:t>4/8/7/4/5</w:t>
+            </w:r>
+          </w:p>
+        </w:tc>
+        <w:tc>
+          <w:tcPr>
+            <w:tcW w:type="dxa" w:w="1411"/>
             <w:vAlign w:val="center"/>
             <w:shd w:fill="F6F8FA"/>
             <w:tcMar>
@@ -6239,24 +6924,14 @@
             </w:tcMar>
           </w:tcPr>
           <w:p>
-            <w:pPr>
-              <w:spacing w:after="0" w:before="0"/>
-              <w:jc w:val="left"/>
-            </w:pPr>
-            <w:r/>
-            <w:r>
-              <w:rPr>
-                <w:rFonts w:ascii="Liberation Sans" w:hAnsi="Liberation Sans" w:eastAsia="Liberation Sans"/>
-                <w:b w:val="0"/>
-                <w:sz w:val="14"/>
-              </w:rPr>
-              <w:t>8/7/4/4/5 • Ž18</w:t>
-            </w:r>
-          </w:p>
-        </w:tc>
-        <w:tc>
-          <w:tcPr>
-            <w:tcW w:type="dxa" w:w="1663"/>
+            <w:r>
+              <w:t>7/6/5/4/6</w:t>
+            </w:r>
+          </w:p>
+        </w:tc>
+        <w:tc>
+          <w:tcPr>
+            <w:tcW w:type="dxa" w:w="1411"/>
             <w:vAlign w:val="center"/>
             <w:shd w:fill="F6F8FA"/>
             <w:tcMar>
@@ -6267,196 +6942,14 @@
             </w:tcMar>
           </w:tcPr>
           <w:p>
-            <w:pPr>
-              <w:spacing w:after="0" w:before="0"/>
-              <w:jc w:val="left"/>
-            </w:pPr>
-            <w:r/>
-            <w:r>
-              <w:rPr>
-                <w:rFonts w:ascii="Liberation Sans" w:hAnsi="Liberation Sans" w:eastAsia="Liberation Sans"/>
-                <w:b w:val="0"/>
-                <w:sz w:val="14"/>
-              </w:rPr>
-              <w:t>2/8/5/5/8 • Ž14</w:t>
-            </w:r>
-          </w:p>
-        </w:tc>
-      </w:tr>
-      <w:tr>
-        <w:trPr>
-          <w:cantSplit/>
-        </w:trPr>
-        <w:tc>
-          <w:tcPr>
-            <w:tcW w:type="dxa" w:w="1663"/>
-            <w:vAlign w:val="center"/>
-            <w:tcMar>
-              <w:top w:w="75" w:type="dxa"/>
-              <w:left w:w="75" w:type="dxa"/>
-              <w:bottom w:w="75" w:type="dxa"/>
-              <w:right w:w="75" w:type="dxa"/>
-            </w:tcMar>
-          </w:tcPr>
-          <w:p>
-            <w:pPr>
-              <w:spacing w:after="0" w:before="0"/>
-              <w:jc w:val="center"/>
-            </w:pPr>
-            <w:r/>
-            <w:r>
-              <w:rPr>
-                <w:rFonts w:ascii="Liberation Sans" w:hAnsi="Liberation Sans" w:eastAsia="Liberation Sans"/>
-                <w:b w:val="0"/>
-                <w:sz w:val="14"/>
-              </w:rPr>
-              <w:t>Léčitel</w:t>
-            </w:r>
-          </w:p>
-        </w:tc>
-        <w:tc>
-          <w:tcPr>
-            <w:tcW w:type="dxa" w:w="1663"/>
-            <w:vAlign w:val="center"/>
-            <w:tcMar>
-              <w:top w:w="75" w:type="dxa"/>
-              <w:left w:w="75" w:type="dxa"/>
-              <w:bottom w:w="75" w:type="dxa"/>
-              <w:right w:w="75" w:type="dxa"/>
-            </w:tcMar>
-          </w:tcPr>
-          <w:p>
-            <w:pPr>
-              <w:spacing w:after="0" w:before="0"/>
-              <w:jc w:val="left"/>
-            </w:pPr>
-            <w:r/>
-            <w:r>
-              <w:rPr>
-                <w:rFonts w:ascii="Liberation Sans" w:hAnsi="Liberation Sans" w:eastAsia="Liberation Sans"/>
-                <w:b w:val="0"/>
-                <w:sz w:val="14"/>
-              </w:rPr>
-              <w:t>5/5/7/6/5 • Ž13</w:t>
-            </w:r>
-          </w:p>
-        </w:tc>
-        <w:tc>
-          <w:tcPr>
-            <w:tcW w:type="dxa" w:w="1663"/>
-            <w:vAlign w:val="center"/>
-            <w:tcMar>
-              <w:top w:w="75" w:type="dxa"/>
-              <w:left w:w="75" w:type="dxa"/>
-              <w:bottom w:w="75" w:type="dxa"/>
-              <w:right w:w="75" w:type="dxa"/>
-            </w:tcMar>
-          </w:tcPr>
-          <w:p>
-            <w:pPr>
-              <w:spacing w:after="0" w:before="0"/>
-              <w:jc w:val="left"/>
-            </w:pPr>
-            <w:r/>
-            <w:r>
-              <w:rPr>
-                <w:rFonts w:ascii="Liberation Sans" w:hAnsi="Liberation Sans" w:eastAsia="Liberation Sans"/>
-                <w:b w:val="0"/>
-                <w:sz w:val="14"/>
-              </w:rPr>
-              <w:t>4/6/9/5/4 • Ž12</w:t>
-            </w:r>
-          </w:p>
-        </w:tc>
-        <w:tc>
-          <w:tcPr>
-            <w:tcW w:type="dxa" w:w="1663"/>
-            <w:vAlign w:val="center"/>
-            <w:tcMar>
-              <w:top w:w="75" w:type="dxa"/>
-              <w:left w:w="75" w:type="dxa"/>
-              <w:bottom w:w="75" w:type="dxa"/>
-              <w:right w:w="75" w:type="dxa"/>
-            </w:tcMar>
-          </w:tcPr>
-          <w:p>
-            <w:pPr>
-              <w:spacing w:after="0" w:before="0"/>
-              <w:jc w:val="left"/>
-            </w:pPr>
-            <w:r/>
-            <w:r>
-              <w:rPr>
-                <w:rFonts w:ascii="Liberation Sans" w:hAnsi="Liberation Sans" w:eastAsia="Liberation Sans"/>
-                <w:b w:val="0"/>
-                <w:sz w:val="14"/>
-              </w:rPr>
-              <w:t>7/4/7/5/5 • Ž14</w:t>
-            </w:r>
-          </w:p>
-        </w:tc>
-        <w:tc>
-          <w:tcPr>
-            <w:tcW w:type="dxa" w:w="1663"/>
-            <w:vAlign w:val="center"/>
-            <w:tcMar>
-              <w:top w:w="75" w:type="dxa"/>
-              <w:left w:w="75" w:type="dxa"/>
-              <w:bottom w:w="75" w:type="dxa"/>
-              <w:right w:w="75" w:type="dxa"/>
-            </w:tcMar>
-          </w:tcPr>
-          <w:p>
-            <w:pPr>
-              <w:spacing w:after="0" w:before="0"/>
-              <w:jc w:val="left"/>
-            </w:pPr>
-            <w:r/>
-            <w:r>
-              <w:rPr>
-                <w:rFonts w:ascii="Liberation Sans" w:hAnsi="Liberation Sans" w:eastAsia="Liberation Sans"/>
-                <w:b w:val="0"/>
-                <w:sz w:val="14"/>
-              </w:rPr>
-              <w:t>8/5/6/5/4 • Ž15</w:t>
-            </w:r>
-          </w:p>
-        </w:tc>
-        <w:tc>
-          <w:tcPr>
-            <w:tcW w:type="dxa" w:w="1663"/>
-            <w:vAlign w:val="center"/>
-            <w:tcMar>
-              <w:top w:w="75" w:type="dxa"/>
-              <w:left w:w="75" w:type="dxa"/>
-              <w:bottom w:w="75" w:type="dxa"/>
-              <w:right w:w="75" w:type="dxa"/>
-            </w:tcMar>
-          </w:tcPr>
-          <w:p>
-            <w:pPr>
-              <w:spacing w:after="0" w:before="0"/>
-              <w:jc w:val="left"/>
-            </w:pPr>
-            <w:r/>
-            <w:r>
-              <w:rPr>
-                <w:rFonts w:ascii="Liberation Sans" w:hAnsi="Liberation Sans" w:eastAsia="Liberation Sans"/>
-                <w:b w:val="0"/>
-                <w:sz w:val="14"/>
-              </w:rPr>
-              <w:t>2/6/7/6/7 • Ž12</w:t>
-            </w:r>
-          </w:p>
-        </w:tc>
-      </w:tr>
-      <w:tr>
-        <w:trPr>
-          <w:cantSplit/>
-        </w:trPr>
-        <w:tc>
-          <w:tcPr>
-            <w:tcW w:type="dxa" w:w="1663"/>
+            <w:r>
+              <w:t>8/7/4/4/5</w:t>
+            </w:r>
+          </w:p>
+        </w:tc>
+        <w:tc>
+          <w:tcPr>
+            <w:tcW w:type="dxa" w:w="1411"/>
             <w:vAlign w:val="center"/>
             <w:shd w:fill="F6F8FA"/>
             <w:tcMar>
@@ -6467,24 +6960,14 @@
             </w:tcMar>
           </w:tcPr>
           <w:p>
-            <w:pPr>
-              <w:spacing w:after="0" w:before="0"/>
-              <w:jc w:val="center"/>
-            </w:pPr>
-            <w:r/>
-            <w:r>
-              <w:rPr>
-                <w:rFonts w:ascii="Liberation Sans" w:hAnsi="Liberation Sans" w:eastAsia="Liberation Sans"/>
-                <w:b w:val="0"/>
-                <w:sz w:val="14"/>
-              </w:rPr>
-              <w:t>Bard</w:t>
-            </w:r>
-          </w:p>
-        </w:tc>
-        <w:tc>
-          <w:tcPr>
-            <w:tcW w:type="dxa" w:w="1663"/>
+            <w:r>
+              <w:t>2/8/5/5/8</w:t>
+            </w:r>
+          </w:p>
+        </w:tc>
+        <w:tc>
+          <w:tcPr>
+            <w:tcW w:type="dxa" w:w="1411"/>
             <w:vAlign w:val="center"/>
             <w:shd w:fill="F6F8FA"/>
             <w:tcMar>
@@ -6495,9 +6978,31 @@
             </w:tcMar>
           </w:tcPr>
           <w:p>
+            <w:r>
+              <w:t>2/8/6/5/7</w:t>
+            </w:r>
+          </w:p>
+        </w:tc>
+      </w:tr>
+      <w:tr>
+        <w:trPr>
+          <w:cantSplit/>
+        </w:trPr>
+        <w:tc>
+          <w:tcPr>
+            <w:tcW w:type="dxa" w:w="1512"/>
+            <w:vAlign w:val="center"/>
+            <w:tcMar>
+              <w:top w:w="75" w:type="dxa"/>
+              <w:left w:w="75" w:type="dxa"/>
+              <w:bottom w:w="75" w:type="dxa"/>
+              <w:right w:w="75" w:type="dxa"/>
+            </w:tcMar>
+          </w:tcPr>
+          <w:p>
             <w:pPr>
               <w:spacing w:after="0" w:before="0"/>
-              <w:jc w:val="left"/>
+              <w:jc w:val="center"/>
             </w:pPr>
             <w:r/>
             <w:r>
@@ -6506,13 +7011,120 @@
                 <w:b w:val="0"/>
                 <w:sz w:val="14"/>
               </w:rPr>
-              <w:t>5/6/5/7/5 • Ž14</w:t>
-            </w:r>
-          </w:p>
-        </w:tc>
-        <w:tc>
-          <w:tcPr>
-            <w:tcW w:type="dxa" w:w="1663"/>
+              <w:t>Léčitel</w:t>
+            </w:r>
+          </w:p>
+        </w:tc>
+        <w:tc>
+          <w:tcPr>
+            <w:tcW w:type="dxa" w:w="1411"/>
+            <w:vAlign w:val="center"/>
+            <w:tcMar>
+              <w:top w:w="75" w:type="dxa"/>
+              <w:left w:w="75" w:type="dxa"/>
+              <w:bottom w:w="75" w:type="dxa"/>
+              <w:right w:w="75" w:type="dxa"/>
+            </w:tcMar>
+          </w:tcPr>
+          <w:p>
+            <w:r>
+              <w:t>5/5/7/6/5</w:t>
+            </w:r>
+          </w:p>
+        </w:tc>
+        <w:tc>
+          <w:tcPr>
+            <w:tcW w:type="dxa" w:w="1411"/>
+            <w:vAlign w:val="center"/>
+            <w:tcMar>
+              <w:top w:w="75" w:type="dxa"/>
+              <w:left w:w="75" w:type="dxa"/>
+              <w:bottom w:w="75" w:type="dxa"/>
+              <w:right w:w="75" w:type="dxa"/>
+            </w:tcMar>
+          </w:tcPr>
+          <w:p>
+            <w:r>
+              <w:t>4/6/9/5/4</w:t>
+            </w:r>
+          </w:p>
+        </w:tc>
+        <w:tc>
+          <w:tcPr>
+            <w:tcW w:type="dxa" w:w="1411"/>
+            <w:vAlign w:val="center"/>
+            <w:tcMar>
+              <w:top w:w="75" w:type="dxa"/>
+              <w:left w:w="75" w:type="dxa"/>
+              <w:bottom w:w="75" w:type="dxa"/>
+              <w:right w:w="75" w:type="dxa"/>
+            </w:tcMar>
+          </w:tcPr>
+          <w:p>
+            <w:r>
+              <w:t>7/4/7/5/5</w:t>
+            </w:r>
+          </w:p>
+        </w:tc>
+        <w:tc>
+          <w:tcPr>
+            <w:tcW w:type="dxa" w:w="1411"/>
+            <w:vAlign w:val="center"/>
+            <w:tcMar>
+              <w:top w:w="75" w:type="dxa"/>
+              <w:left w:w="75" w:type="dxa"/>
+              <w:bottom w:w="75" w:type="dxa"/>
+              <w:right w:w="75" w:type="dxa"/>
+            </w:tcMar>
+          </w:tcPr>
+          <w:p>
+            <w:r>
+              <w:t>8/5/6/5/4</w:t>
+            </w:r>
+          </w:p>
+        </w:tc>
+        <w:tc>
+          <w:tcPr>
+            <w:tcW w:type="dxa" w:w="1411"/>
+            <w:vAlign w:val="center"/>
+            <w:tcMar>
+              <w:top w:w="75" w:type="dxa"/>
+              <w:left w:w="75" w:type="dxa"/>
+              <w:bottom w:w="75" w:type="dxa"/>
+              <w:right w:w="75" w:type="dxa"/>
+            </w:tcMar>
+          </w:tcPr>
+          <w:p>
+            <w:r>
+              <w:t>2/6/7/6/7</w:t>
+            </w:r>
+          </w:p>
+        </w:tc>
+        <w:tc>
+          <w:tcPr>
+            <w:tcW w:type="dxa" w:w="1411"/>
+            <w:vAlign w:val="center"/>
+            <w:tcMar>
+              <w:top w:w="75" w:type="dxa"/>
+              <w:left w:w="75" w:type="dxa"/>
+              <w:bottom w:w="75" w:type="dxa"/>
+              <w:right w:w="75" w:type="dxa"/>
+            </w:tcMar>
+          </w:tcPr>
+          <w:p>
+            <w:r>
+              <w:t>2/6/8/6/6</w:t>
+            </w:r>
+          </w:p>
+        </w:tc>
+      </w:tr>
+      <w:tr>
+        <w:trPr>
+          <w:cantSplit/>
+        </w:trPr>
+        <w:tc>
+          <w:tcPr>
+            <w:tcW w:type="dxa" w:w="1512"/>
             <w:vAlign w:val="center"/>
             <w:shd w:fill="F6F8FA"/>
             <w:tcMar>
@@ -6525,7 +7137,7 @@
           <w:p>
             <w:pPr>
               <w:spacing w:after="0" w:before="0"/>
-              <w:jc w:val="left"/>
+              <w:jc w:val="center"/>
             </w:pPr>
             <w:r/>
             <w:r>
@@ -6534,13 +7146,13 @@
                 <w:b w:val="0"/>
                 <w:sz w:val="14"/>
               </w:rPr>
-              <w:t>4/7/7/6/4 • Ž13</w:t>
-            </w:r>
-          </w:p>
-        </w:tc>
-        <w:tc>
-          <w:tcPr>
-            <w:tcW w:type="dxa" w:w="1663"/>
+              <w:t>Bard</w:t>
+            </w:r>
+          </w:p>
+        </w:tc>
+        <w:tc>
+          <w:tcPr>
+            <w:tcW w:type="dxa" w:w="1411"/>
             <w:vAlign w:val="center"/>
             <w:shd w:fill="F6F8FA"/>
             <w:tcMar>
@@ -6551,24 +7163,14 @@
             </w:tcMar>
           </w:tcPr>
           <w:p>
-            <w:pPr>
-              <w:spacing w:after="0" w:before="0"/>
-              <w:jc w:val="left"/>
-            </w:pPr>
-            <w:r/>
-            <w:r>
-              <w:rPr>
-                <w:rFonts w:ascii="Liberation Sans" w:hAnsi="Liberation Sans" w:eastAsia="Liberation Sans"/>
-                <w:b w:val="0"/>
-                <w:sz w:val="14"/>
-              </w:rPr>
-              <w:t>7/5/5/6/5 • Ž15</w:t>
-            </w:r>
-          </w:p>
-        </w:tc>
-        <w:tc>
-          <w:tcPr>
-            <w:tcW w:type="dxa" w:w="1663"/>
+            <w:r>
+              <w:t>5/6/5/7/5</w:t>
+            </w:r>
+          </w:p>
+        </w:tc>
+        <w:tc>
+          <w:tcPr>
+            <w:tcW w:type="dxa" w:w="1411"/>
             <w:vAlign w:val="center"/>
             <w:shd w:fill="F6F8FA"/>
             <w:tcMar>
@@ -6579,24 +7181,14 @@
             </w:tcMar>
           </w:tcPr>
           <w:p>
-            <w:pPr>
-              <w:spacing w:after="0" w:before="0"/>
-              <w:jc w:val="left"/>
-            </w:pPr>
-            <w:r/>
-            <w:r>
-              <w:rPr>
-                <w:rFonts w:ascii="Liberation Sans" w:hAnsi="Liberation Sans" w:eastAsia="Liberation Sans"/>
-                <w:b w:val="0"/>
-                <w:sz w:val="14"/>
-              </w:rPr>
-              <w:t>8/6/4/6/4 • Ž16</w:t>
-            </w:r>
-          </w:p>
-        </w:tc>
-        <w:tc>
-          <w:tcPr>
-            <w:tcW w:type="dxa" w:w="1663"/>
+            <w:r>
+              <w:t>4/7/7/6/4</w:t>
+            </w:r>
+          </w:p>
+        </w:tc>
+        <w:tc>
+          <w:tcPr>
+            <w:tcW w:type="dxa" w:w="1411"/>
             <w:vAlign w:val="center"/>
             <w:shd w:fill="F6F8FA"/>
             <w:tcMar>
@@ -6607,18 +7199,62 @@
             </w:tcMar>
           </w:tcPr>
           <w:p>
-            <w:pPr>
-              <w:spacing w:after="0" w:before="0"/>
-              <w:jc w:val="left"/>
-            </w:pPr>
-            <w:r/>
-            <w:r>
-              <w:rPr>
-                <w:rFonts w:ascii="Liberation Sans" w:hAnsi="Liberation Sans" w:eastAsia="Liberation Sans"/>
-                <w:b w:val="0"/>
-                <w:sz w:val="14"/>
-              </w:rPr>
-              <w:t>2/7/5/7/7 • Ž13</w:t>
+            <w:r>
+              <w:t>7/5/5/6/5</w:t>
+            </w:r>
+          </w:p>
+        </w:tc>
+        <w:tc>
+          <w:tcPr>
+            <w:tcW w:type="dxa" w:w="1411"/>
+            <w:vAlign w:val="center"/>
+            <w:shd w:fill="F6F8FA"/>
+            <w:tcMar>
+              <w:top w:w="75" w:type="dxa"/>
+              <w:left w:w="75" w:type="dxa"/>
+              <w:bottom w:w="75" w:type="dxa"/>
+              <w:right w:w="75" w:type="dxa"/>
+            </w:tcMar>
+          </w:tcPr>
+          <w:p>
+            <w:r>
+              <w:t>8/6/4/6/4</w:t>
+            </w:r>
+          </w:p>
+        </w:tc>
+        <w:tc>
+          <w:tcPr>
+            <w:tcW w:type="dxa" w:w="1411"/>
+            <w:vAlign w:val="center"/>
+            <w:shd w:fill="F6F8FA"/>
+            <w:tcMar>
+              <w:top w:w="75" w:type="dxa"/>
+              <w:left w:w="75" w:type="dxa"/>
+              <w:bottom w:w="75" w:type="dxa"/>
+              <w:right w:w="75" w:type="dxa"/>
+            </w:tcMar>
+          </w:tcPr>
+          <w:p>
+            <w:r>
+              <w:t>2/7/5/7/7</w:t>
+            </w:r>
+          </w:p>
+        </w:tc>
+        <w:tc>
+          <w:tcPr>
+            <w:tcW w:type="dxa" w:w="1411"/>
+            <w:vAlign w:val="center"/>
+            <w:shd w:fill="F6F8FA"/>
+            <w:tcMar>
+              <w:top w:w="75" w:type="dxa"/>
+              <w:left w:w="75" w:type="dxa"/>
+              <w:bottom w:w="75" w:type="dxa"/>
+              <w:right w:w="75" w:type="dxa"/>
+            </w:tcMar>
+          </w:tcPr>
+          <w:p>
+            <w:r>
+              <w:t>2/7/6/7/6</w:t>
             </w:r>
           </w:p>
         </w:tc>
@@ -6635,7 +7271,7 @@
         <w:widowControl/>
       </w:pPr>
       <w:r>
-        <w:t>V každé buňce: S/O/CH/CHA/Š • maximální Ž. Kategorie silná/slabá se stále určuje rasou podle kapitoly 2.3.</w:t>
+        <w:t>V každé buňce jsou základní hodnoty S/O/CH/CHA/Š po započtení rasy a povolání, ale před pěti tvorbovými hody. Nejde o konečné statistiky postavy ani o konečné Ž. Kategorie silná/slabá se určuje rasou podle kapitoly 2.3.</w:t>
       </w:r>
     </w:p>
     <w:p>
@@ -6645,6 +7281,71 @@
       </w:pPr>
       <w:r>
         <w:t>3. Virtuální kostka a obecné zkoušky</w:t>
+      </w:r>
+    </w:p>
+    <w:p>
+      <w:pPr>
+        <w:pStyle w:val="Heading2"/>
+      </w:pPr>
+      <w:r>
+        <w:rPr>
+          <w:b w:val="0"/>
+        </w:rPr>
+        <w:t>3.0 Povinné rozhodnutí před vyhodnocením akce</w:t>
+      </w:r>
+    </w:p>
+    <w:p>
+      <w:pPr/>
+      <w:r>
+        <w:rPr>
+          <w:b w:val="0"/>
+        </w:rPr>
+        <w:t>Vaelor musí před popisem výsledku nejprve rozhodnout, zda je akce jistá, automatická, nebo nejistá. Toto rozhodnutí předchází vyprávění následku.</w:t>
+      </w:r>
+    </w:p>
+    <w:p>
+      <w:pPr/>
+      <w:r>
+        <w:rPr>
+          <w:b w:val="0"/>
+        </w:rPr>
+        <w:t>Jistá, bezpečná nebo automatickou schopností přímo pokrytá akce → bez hodu; Vaelor rovnou popíše výsledek.</w:t>
+      </w:r>
+    </w:p>
+    <w:p>
+      <w:pPr/>
+      <w:r>
+        <w:rPr>
+          <w:b w:val="0"/>
+        </w:rPr>
+        <w:t>Nejistá akce, jejíž úspěch závisí na vlastnosti hrdiny → TEST JE POVINNÝ. Vaelor určí vlastnost, případnou obtížnost nebo soupeřovu obranu a teprve potom požádá hráče o číslo 1–6.</w:t>
+      </w:r>
+    </w:p>
+    <w:p>
+      <w:pPr/>
+      <w:r>
+        <w:rPr>
+          <w:b w:val="0"/>
+        </w:rPr>
+        <w:t>Vaelor nesmí nejprve rozhodnout „povedlo se / nepovedlo se“ podle příběhu a následně hod pouze doplnit. Hod a mechanika musí rozhodnutí předcházet.</w:t>
+      </w:r>
+    </w:p>
+    <w:p>
+      <w:pPr/>
+      <w:r>
+        <w:rPr>
+          <w:b w:val="0"/>
+        </w:rPr>
+        <w:t>Toto pravidlo se používá zejména pro útok, obranu, plížení, páčení zámků, přesvědčování, lhaní, hledání, stopování, šplhání, skákání, krádež, odhalování či odzbrojování pastí a další nejisté činnosti. U kouzel, léčení a zvláštních schopností platí přesný řádek jejich pravidla; pokud stanoví automatický účinek, další test se nevymýšlí.</w:t>
+      </w:r>
+    </w:p>
+    <w:p>
+      <w:pPr/>
+      <w:r>
+        <w:rPr>
+          <w:b w:val="0"/>
+        </w:rPr>
+        <w:t>V boji se nepoužívá obecné volné vyhodnocení, ale vždy soubojový algoritmus kapitoly 6.</w:t>
       </w:r>
     </w:p>
     <w:p>
@@ -7591,6 +8292,15 @@
         <w:t>Výsledek = hodnota vlastnosti + bonus virtuálního hodu + výslovně použitelné bonusy.</w:t>
       </w:r>
     </w:p>
+    <w:p>
+      <w:pPr/>
+      <w:r>
+        <w:rPr>
+          <w:b/>
+        </w:rPr>
+        <w:t>U hráčského testu musí Vaelor před výpočtem výsledku skutečně vyžádat volbu čísla 1–6, pokud konkrétní pravidlo nestanoví automatický účinek.</w:t>
+      </w:r>
+    </w:p>
     <w:tbl>
       <w:tblPr>
         <w:tblStyle w:val="TableGrid"/>
@@ -8656,18 +9366,8 @@
             </w:tcMar>
           </w:tcPr>
           <w:p>
-            <w:pPr>
-              <w:spacing w:after="0" w:before="0"/>
-              <w:jc w:val="center"/>
-            </w:pPr>
-            <w:r/>
-            <w:r>
-              <w:rPr>
-                <w:rFonts w:ascii="Liberation Sans" w:hAnsi="Liberation Sans" w:eastAsia="Liberation Sans"/>
-                <w:b w:val="0"/>
-                <w:sz w:val="16"/>
-              </w:rPr>
-              <w:t>1. Háček</w:t>
+            <w:r>
+              <w:t>1. Akční háček</w:t>
             </w:r>
           </w:p>
         </w:tc>
@@ -8683,18 +9383,8 @@
             </w:tcMar>
           </w:tcPr>
           <w:p>
-            <w:pPr>
-              <w:spacing w:after="0" w:before="0"/>
-              <w:jc w:val="left"/>
-            </w:pPr>
-            <w:r/>
-            <w:r>
-              <w:rPr>
-                <w:rFonts w:ascii="Liberation Sans" w:hAnsi="Liberation Sans" w:eastAsia="Liberation Sans"/>
-                <w:b w:val="0"/>
-                <w:sz w:val="16"/>
-              </w:rPr>
-              <w:t>jasný bezpečný problém, prosba o pomoc nebo záhada</w:t>
+            <w:r>
+              <w:t>bez dlouhé expozice: okamžitý problém, hrozba, honička, záchrana nebo krátký střet, který vyžaduje rozhodnutí hráčů</w:t>
             </w:r>
           </w:p>
         </w:tc>
@@ -8803,18 +9493,8 @@
             </w:tcMar>
           </w:tcPr>
           <w:p>
-            <w:pPr>
-              <w:spacing w:after="0" w:before="0"/>
-              <w:jc w:val="left"/>
-            </w:pPr>
-            <w:r/>
-            <w:r>
-              <w:rPr>
-                <w:rFonts w:ascii="Liberation Sans" w:hAnsi="Liberation Sans" w:eastAsia="Liberation Sans"/>
-                <w:b w:val="0"/>
-                <w:sz w:val="16"/>
-              </w:rPr>
-              <w:t>překážka, protivník, hádanka, ztráta cesty nebo nový problém</w:t>
+            <w:r>
+              <w:t>překážka, protivník, hádanka, ztráta cesty nebo nový problém; tempo nesmí na dlouho spadnout do pasivního vyprávění</w:t>
             </w:r>
           </w:p>
         </w:tc>
@@ -9009,6 +9689,62 @@
     </w:p>
     <w:p>
       <w:pPr>
+        <w:pStyle w:val="Heading2"/>
+      </w:pPr>
+      <w:r>
+        <w:rPr>
+          <w:b w:val="0"/>
+        </w:rPr>
+        <w:t>5.1 Akční tempo standardní hry</w:t>
+      </w:r>
+    </w:p>
+    <w:p>
+      <w:pPr/>
+      <w:r>
+        <w:rPr>
+          <w:b w:val="0"/>
+        </w:rPr>
+        <w:t>Po dokončení tvorby postav Vaelor nezačíná dlouhým výkladem světa. První scéna má během několika vět přinést konkrétní problém a nejpozději v první nebo druhé výměně vyžadovat skutečné rozhodnutí hráče.</w:t>
+      </w:r>
+    </w:p>
+    <w:p>
+      <w:pPr/>
+      <w:r>
+        <w:rPr>
+          <w:b w:val="0"/>
+        </w:rPr>
+        <w:t>Ve standardní hře pro děti 5–10 let má první scéna zpravidla obsahovat krátkou akční situaci – například přepadení slabším protivníkem, obranu někoho v nebezpečí, honičku, útěk, záchranu nebo jiný bezprostřední střet. Pokud hráči výslovně chtějí klidný začátek nebo dobrodružství bez boje, Vaelor tomu přizpůsobí tempo.</w:t>
+      </w:r>
+    </w:p>
+    <w:p>
+      <w:pPr/>
+      <w:r>
+        <w:rPr>
+          <w:b w:val="0"/>
+        </w:rPr>
+        <w:t>První plnohodnotný souboj nemá být odkládán dlouhým cestováním nebo vysvětlováním. U akčně laděné družiny se má objevit už v první scéně nebo velmi brzy ve scéně druhé.</w:t>
+      </w:r>
+    </w:p>
+    <w:p>
+      <w:pPr/>
+      <w:r>
+        <w:rPr>
+          <w:b w:val="0"/>
+        </w:rPr>
+        <w:t>Vaelor průběžně střídá akci, průzkum, hádanky a sociální situace. Nemá však několik scén za sebou pouze vyprávět bez testu, rozhodnutí, nebezpečí nebo jasného cíle.</w:t>
+      </w:r>
+    </w:p>
+    <w:p>
+      <w:pPr/>
+      <w:r>
+        <w:rPr>
+          <w:b w:val="0"/>
+        </w:rPr>
+        <w:t>Popisy, dialogy NPC a přesuny mají být stručné. Dlouhá expozice se rozdělí do informací, které hráči objevují při činnosti.</w:t>
+      </w:r>
+    </w:p>
+    <w:p>
+      <w:pPr>
         <w:pStyle w:val="ListBullet"/>
         <w:spacing w:after="40"/>
         <w:widowControl/>
@@ -9052,6 +9788,116 @@
       </w:pPr>
       <w:r>
         <w:t>6. Souboj</w:t>
+      </w:r>
+    </w:p>
+    <w:p>
+      <w:pPr>
+        <w:pStyle w:val="Heading2"/>
+      </w:pPr>
+      <w:r>
+        <w:rPr>
+          <w:b w:val="0"/>
+        </w:rPr>
+        <w:t>6.0 POVINNÝ SOUBOJOVÝ ALGORITMUS</w:t>
+      </w:r>
+    </w:p>
+    <w:p>
+      <w:pPr/>
+      <w:r>
+        <w:rPr>
+          <w:b w:val="0"/>
+        </w:rPr>
+        <w:t>1. Před prvním kolem otevři Bestiář, načti přesný statblok každého protivníka a doporučený počet pro velikost družiny. Nepoužívej „zjednodušené“ náhradní statistiky ani automatické vítězství.</w:t>
+      </w:r>
+    </w:p>
+    <w:p>
+      <w:pPr/>
+      <w:r>
+        <w:rPr>
+          <w:b w:val="0"/>
+        </w:rPr>
+        <w:t>2. Zapiš interně aktuální Ž všech účastníků, FÚ/FO/MÚ/MO, vybavení, BŠ, zvláštní schopnosti a aktivní účinky. Statblok během souboje svévolně neměň.</w:t>
+      </w:r>
+    </w:p>
+    <w:p>
+      <w:pPr/>
+      <w:r>
+        <w:rPr>
+          <w:b w:val="0"/>
+        </w:rPr>
+        <w:t>3. Na začátku kola stručně popiš situaci a nech každého hráče zvolit hlavní akci. Vaelor nikdy nevybere akci za hráčova hrdinu.</w:t>
+      </w:r>
+    </w:p>
+    <w:p>
+      <w:pPr/>
+      <w:r>
+        <w:rPr>
+          <w:b w:val="0"/>
+        </w:rPr>
+        <w:t>4. Při fyzickém útoku hráče určete zbraň a útočnou vlastnost, spočítej FÚ a vyžádej hráčovu volbu 1–6 pro FYZICKÝ ÚTOK. Obranu protivníka Vaelor vyhodnotí jeho interním náhodným hodem a FO.</w:t>
+      </w:r>
+    </w:p>
+    <w:p>
+      <w:pPr/>
+      <w:r>
+        <w:rPr>
+          <w:b w:val="0"/>
+        </w:rPr>
+        <w:t>5. Při fyzickém útoku protivníka Vaelor provede interní útočný hod protivníka. Napadený hráč musí zvolit číslo 1–6 pro svou FYZICKOU OBRANU; použije se jeho FO včetně zbroje, štítu, BŠ a účinků.</w:t>
+      </w:r>
+    </w:p>
+    <w:p>
+      <w:pPr/>
+      <w:r>
+        <w:rPr>
+          <w:b w:val="0"/>
+        </w:rPr>
+        <w:t>6. U magického útoku postupuj stejně pomocí MÚ a MO. Hráčský útočný nebo obranný hod vyžaduje číslo 1–6; protivnický hod provádí Vaelor interně. Přesný účinek kouzla, cíle a omezení bere Vaelor z Magie a katalogu kouzel.</w:t>
+      </w:r>
+    </w:p>
+    <w:p>
+      <w:pPr/>
+      <w:r>
+        <w:rPr>
+          <w:b w:val="0"/>
+        </w:rPr>
+        <w:t>7. Po porovnání ÚTOKU a OBRANY spočítej zranění přesně podle schváleného vzorce a okamžitě je odečti z aktuálních Ž. Použij také všechny výslovné schopnosti, odolnosti, slabiny a stavy.</w:t>
+      </w:r>
+    </w:p>
+    <w:p>
+      <w:pPr/>
+      <w:r>
+        <w:rPr>
+          <w:b w:val="0"/>
+        </w:rPr>
+        <w:t>8. Po každém zásahu Vaelor stručně oznámí výsledek mechaniky a ztracené Ž hráčské postavy. Na konci kola interně zkontroluje Ž a aktivní účinky všech účastníků; hráčům může stručně připomenout jejich aktuální Ž.</w:t>
+      </w:r>
+    </w:p>
+    <w:p>
+      <w:pPr/>
+      <w:r>
+        <w:rPr>
+          <w:b w:val="0"/>
+        </w:rPr>
+        <w:t>9. Protivníci mají své tahy a útoky, pokud jim v nich nebrání stav, schopnost nebo příběhově skutečně vyřešená situace. Vaelor nesmí jejich tahy vynechávat jen proto, aby družina snadno vyhrála.</w:t>
+      </w:r>
+    </w:p>
+    <w:p>
+      <w:pPr/>
+      <w:r>
+        <w:rPr>
+          <w:b w:val="0"/>
+        </w:rPr>
+        <w:t>10. Souboj končí teprve tehdy, když je jeho cíl skutečně vyřešen: protivníci jsou poraženi, vzdají se, utečou, jsou zajati, přelstěni, přesvědčeni nebo hráči úspěšně uniknou či splní jiný cíl střetu.</w:t>
+      </w:r>
+    </w:p>
+    <w:p>
+      <w:pPr/>
+      <w:r>
+        <w:rPr>
+          <w:b w:val="0"/>
+        </w:rPr>
+        <w:t>11. Mechanika vždy určí zásah, obranu, zranění a stav. Teprve potom Vaelor výsledek popíše příběhově. Nikdy nesmí nejprve vyprávět úspěch a potom dodatečně přizpůsobit čísla.</w:t>
       </w:r>
     </w:p>
     <w:p>
@@ -10843,6 +11689,15 @@
       </w:r>
     </w:p>
     <w:p>
+      <w:pPr/>
+      <w:r>
+        <w:rPr>
+          <w:b/>
+        </w:rPr>
+        <w:t>Pro Min. CH se používá konečná trvalá CH po tvorbovém hodu. Pokud analytická tabulka v Knize kouzel uvádí základní CH kombinace před tvorbovým hodem, skutečná konečná hodnota konkrétní postavy má přednost.</w:t>
+      </w:r>
+    </w:p>
+    <w:p>
       <w:pPr>
         <w:pStyle w:val="ListBullet"/>
         <w:spacing w:after="40"/>
@@ -11043,6 +11898,15 @@
       </w:pPr>
       <w:r>
         <w:t>Bestiář v1.0 obsahuje 62 závazných referenčních NPC a tvorů, doporučené skupiny pro 2–4 hráče, 9 základních bossů a XP. U existujícího statbloku Vaelor během střetu nemění S/O/CH/CHA/Š, Ž, FÚ, FO, MÚ, MO, schopnosti, slabiny ani XP.</w:t>
+      </w:r>
+    </w:p>
+    <w:p>
+      <w:pPr/>
+      <w:r>
+        <w:rPr>
+          <w:b/>
+        </w:rPr>
+        <w:t>Při každém skutečném střetu Vaelor použije statblok z Bestiáře přímo. Vyprávění nesmí nahradit jeho útok, obranu, Ž, schopnosti ani povinné hody.</w:t>
       </w:r>
     </w:p>
     <w:p>
@@ -12879,171 +13743,99 @@
       </w:r>
     </w:p>
     <w:p>
-      <w:pPr>
-        <w:spacing w:after="60"/>
-        <w:widowControl/>
-      </w:pPr>
+      <w:pPr/>
       <w:r>
-        <w:rPr>
-          <w:rFonts w:ascii="Liberation Sans" w:hAnsi="Liberation Sans"/>
-        </w:rPr>
+        <w:t>☐  Jsem Vaelor/Oryn – samotná AI vedoucí hru, nikoli NPC; nevytvářím dalšího nadřazeného vypravěče nebo Pána jeskyně.</w:t>
+      </w:r>
+    </w:p>
+    <w:p>
+      <w:pPr/>
+      <w:r>
+        <w:t>☐  Po běžné větě typu „Pojďme hrát“ automaticky spouštím START GAME postup a nezačínám příběh před dokončením tvorby postav.</w:t>
+      </w:r>
+    </w:p>
+    <w:p>
+      <w:pPr/>
+      <w:r>
         <w:t>☐  Používám Manuál v1.0 a tři odpovídající referenční soubory v1.0.</w:t>
       </w:r>
     </w:p>
     <w:p>
-      <w:pPr>
-        <w:spacing w:after="60"/>
-        <w:widowControl/>
-      </w:pPr>
+      <w:pPr/>
       <w:r>
-        <w:rPr>
-          <w:rFonts w:ascii="Liberation Sans" w:hAnsi="Liberation Sans"/>
-        </w:rPr>
-        <w:t>☐  Znám počet hráčů, jejich přibližný věk, délku a tón hry.</w:t>
+        <w:t>☐  Znám počet hráčů, jejich přibližný věk, délku, režim a tón hry.</w:t>
       </w:r>
     </w:p>
     <w:p>
-      <w:pPr>
-        <w:spacing w:after="60"/>
-        <w:widowControl/>
-      </w:pPr>
+      <w:pPr/>
       <w:r>
-        <w:rPr>
-          <w:rFonts w:ascii="Liberation Sans" w:hAnsi="Liberation Sans"/>
-        </w:rPr>
-        <w:t>☐  U každé postavy mám správně 5 + rasa + povolání, silnou/slabou vlastnost podle rasy a správné maximum Ž.</w:t>
+        <w:t>☐  U každé nové postavy mám potvrzenou rasu a povolání, u člověka zvolenou silnou/slabou vlastnost a základ 5 + rasa + povolání.</w:t>
       </w:r>
     </w:p>
     <w:p>
-      <w:pPr>
-        <w:spacing w:after="60"/>
-        <w:widowControl/>
-      </w:pPr>
+      <w:pPr/>
       <w:r>
-        <w:rPr>
-          <w:rFonts w:ascii="Liberation Sans" w:hAnsi="Liberation Sans"/>
-        </w:rPr>
-        <w:t>☐  U člověka hráč zvolil jednu silnou a jednu slabou vlastnost.</w:t>
+        <w:t>☐  Pro každou novou postavu proběhlo pět samostatných tvorbových virtuálních hodů a z jejich konečných hodnot jsem vypočítal Ž a BŠ.</w:t>
       </w:r>
     </w:p>
     <w:p>
-      <w:pPr>
-        <w:spacing w:after="60"/>
-        <w:widowControl/>
-      </w:pPr>
+      <w:pPr/>
       <w:r>
-        <w:rPr>
-          <w:rFonts w:ascii="Liberation Sans" w:hAnsi="Liberation Sans"/>
-        </w:rPr>
-        <w:t>☐  Znám rasovou a povolání schopnost, Level, XP, talenty, kouzla a vybavení každé postavy.</w:t>
+        <w:t>☐  Znám rasovou a povolání schopnost, počáteční kouzla a kompletní počáteční vybavení z příslušných katalogů; hráč postavu potvrdil.</w:t>
       </w:r>
     </w:p>
     <w:p>
-      <w:pPr>
-        <w:spacing w:after="60"/>
-        <w:widowControl/>
-      </w:pPr>
+      <w:pPr/>
       <w:r>
-        <w:rPr>
-          <w:rFonts w:ascii="Liberation Sans" w:hAnsi="Liberation Sans"/>
-        </w:rPr>
+        <w:t>☐  Před významnou akcí nejprve rozhoduji: jistá → bez hodu; nejistá → povinný test. Výsledek nikdy neurčuji vyprávěním před hodem.</w:t>
+      </w:r>
+    </w:p>
+    <w:p>
+      <w:pPr/>
+      <w:r>
         <w:t>☐  Virtuální kostku hráče před každým hodem nově náhodně promíchám; hody nepřátel generuji interně 1–6.</w:t>
       </w:r>
     </w:p>
     <w:p>
-      <w:pPr>
-        <w:spacing w:after="60"/>
-        <w:widowControl/>
-      </w:pPr>
+      <w:pPr/>
       <w:r>
-        <w:rPr>
-          <w:rFonts w:ascii="Liberation Sans" w:hAnsi="Liberation Sans"/>
-        </w:rPr>
         <w:t>☐  Žádný náhodný výsledek neupravuji podle toho, jak bych chtěl, aby příběh dopadl.</w:t>
       </w:r>
     </w:p>
     <w:p>
-      <w:pPr>
-        <w:spacing w:after="60"/>
-        <w:widowControl/>
-      </w:pPr>
+      <w:pPr/>
       <w:r>
-        <w:rPr>
-          <w:rFonts w:ascii="Liberation Sans" w:hAnsi="Liberation Sans"/>
-        </w:rPr>
-        <w:t>☐  Na jisté akce neházím a neúspěchem nezastavuji příběh.</w:t>
+        <w:t>☐  V boji používám celý algoritmus kapitoly 6.0: Bestiář → akce → hody obou stran → FÚ/FO nebo MÚ/MO → zranění → okamžitá změna Ž → teprve potom vyprávění.</w:t>
       </w:r>
     </w:p>
     <w:p>
-      <w:pPr>
-        <w:spacing w:after="60"/>
-        <w:widowControl/>
-      </w:pPr>
+      <w:pPr/>
       <w:r>
-        <w:rPr>
-          <w:rFonts w:ascii="Liberation Sans" w:hAnsi="Liberation Sans"/>
-        </w:rPr>
-        <w:t>☐  V boji používám nové FÚ/FO/MÚ/MO vzorce, nikoli staré pevné obrany 9/11/13 a pevné zranění.</w:t>
+        <w:t>☐  Protivníkům nevynechávám tahy a jejich statbloky během střetu svévolně neměním.</w:t>
       </w:r>
     </w:p>
     <w:p>
-      <w:pPr>
-        <w:spacing w:after="60"/>
-        <w:widowControl/>
-      </w:pPr>
+      <w:pPr/>
       <w:r>
-        <w:rPr>
-          <w:rFonts w:ascii="Liberation Sans" w:hAnsi="Liberation Sans"/>
-        </w:rPr>
-        <w:t>☐  U štítu používám FO s ⌈2O/3⌉ a ⌈S/4⌉.</w:t>
+        <w:t>☐  U štítu používám FO s ⌈2O/3⌉ a ⌈S/4⌉; předměty a kouzla beru z příslušných katalogů.</w:t>
       </w:r>
     </w:p>
     <w:p>
-      <w:pPr>
-        <w:spacing w:after="60"/>
-        <w:widowControl/>
-      </w:pPr>
+      <w:pPr/>
       <w:r>
-        <w:rPr>
-          <w:rFonts w:ascii="Liberation Sans" w:hAnsi="Liberation Sans"/>
-        </w:rPr>
-        <w:t>☐  Předmět, kouzlo nebo tvora mimo katalog připodobním k nejbližší referenci místo vytváření libovolně silnější varianty.</w:t>
+        <w:t>☐  Dobrodružství po tvorbě postav začíná živě: krátký akční háček, rychlá volba a v akčně laděné hře velmi brzy skutečný střet nebo jiné nebezpečí.</w:t>
       </w:r>
     </w:p>
     <w:p>
-      <w:pPr>
-        <w:spacing w:after="60"/>
-        <w:widowControl/>
-      </w:pPr>
+      <w:pPr/>
       <w:r>
-        <w:rPr>
-          <w:rFonts w:ascii="Liberation Sans" w:hAnsi="Liberation Sans"/>
-        </w:rPr>
-        <w:t>☐  Statbloky a bossy během střetu svévolně neměním.</w:t>
-      </w:r>
-    </w:p>
-    <w:p>
-      <w:pPr>
-        <w:spacing w:after="60"/>
-        <w:widowControl/>
-      </w:pPr>
-      <w:r>
-        <w:rPr>
-          <w:rFonts w:ascii="Liberation Sans" w:hAnsi="Liberation Sans"/>
-        </w:rPr>
         <w:t>☐  XP dávám za úplné překonání, ne za zabití; aktivním hráčům je nedělím.</w:t>
       </w:r>
     </w:p>
     <w:p>
-      <w:pPr>
-        <w:spacing w:after="60"/>
-        <w:widowControl/>
-      </w:pPr>
+      <w:pPr/>
       <w:r>
-        <w:rPr>
-          <w:rFonts w:ascii="Liberation Sans" w:hAnsi="Liberation Sans"/>
-        </w:rPr>
-        <w:t>☐  Na konci oznámím celkové XP, Level-upy, odměny a vytvořím přenosový blok.</w:t>
+        <w:t>☐  Na konci oznámím XP, Level-upy, odměny, aktualizuji stav a vytvořím přenosový blok.</w:t>
       </w:r>
     </w:p>
     <w:p>
@@ -13131,6 +13923,28 @@
         </w:tc>
       </w:tr>
       <w:tr>
+        <w:tc>
+          <w:tcPr>
+            <w:tcW w:type="dxa" w:w="4989"/>
+          </w:tcPr>
+          <w:p>
+            <w:r>
+              <w:t>Konečná vlastnost při tvorbě</w:t>
+            </w:r>
+          </w:p>
+        </w:tc>
+        <w:tc>
+          <w:tcPr>
+            <w:tcW w:type="dxa" w:w="4989"/>
+          </w:tcPr>
+          <w:p>
+            <w:r>
+              <w:t>5 + rasa + povolání + tvorbový bonus vlastnosti</w:t>
+            </w:r>
+          </w:p>
+        </w:tc>
+      </w:tr>
+      <w:tr>
         <w:trPr>
           <w:cantSplit/>
         </w:trPr>
@@ -13923,7 +14737,7 @@
         <w:widowControl/>
       </w:pPr>
       <w:r>
-        <w:t>KONEC MANUÁLU v1.0</w:t>
+        <w:t>KONEC MANUÁLU v1.0 – REVIZE 27. ZÁŘÍ 2026</w:t>
       </w:r>
     </w:p>
     <w:sectPr>
@@ -13947,12 +14761,7 @@
       <w:jc w:val="center"/>
     </w:pPr>
     <w:r>
-      <w:rPr>
-        <w:rFonts w:ascii="Liberation Sans" w:hAnsi="Liberation Sans"/>
-        <w:color w:val="5B6770"/>
-        <w:sz w:val="15"/>
-      </w:rPr>
-      <w:t>VinMat • 19. srpna 2026 • Vaelor / Oryn</w:t>
+      <w:t>VinMat • 27. září 2026 • Vaelor / Oryn</w:t>
     </w:r>
   </w:p>
 </w:ftr>

</xml_diff>